<commit_message>
docs(thesis): remove embedded code excerpts
</commit_message>
<xml_diff>
--- a/6020222035-彭益举/2425_41_10475_080902_6020222035_LW.docx
+++ b/6020222035-彭益举/2425_41_10475_080902_6020222035_LW.docx
@@ -2298,7 +2298,7 @@
         </w:rPr>
         <w:t>5.2.2 选课操作页面</w:t>
         <w:tab/>
-        <w:t>21</w:t>
+        <w:t>20</w:t>
       </w:r>
     </w:p>
     <w:p>
@@ -2318,7 +2318,7 @@
         </w:rPr>
         <w:t>5.2.3 选课结果通知页面</w:t>
         <w:tab/>
-        <w:t>22</w:t>
+        <w:t>21</w:t>
       </w:r>
     </w:p>
     <w:p>
@@ -2338,7 +2338,7 @@
         </w:rPr>
         <w:t>5.2.4 统一登录与网关转发流程</w:t>
         <w:tab/>
-        <w:t>23</w:t>
+        <w:t>22</w:t>
       </w:r>
     </w:p>
     <w:p>
@@ -2358,7 +2358,7 @@
         </w:rPr>
         <w:t>5.3 课程冲突检测模块</w:t>
         <w:tab/>
-        <w:t>24</w:t>
+        <w:t>23</w:t>
       </w:r>
     </w:p>
     <w:p>
@@ -2378,7 +2378,7 @@
         </w:rPr>
         <w:t>5.3.1 冲突检测算法实现</w:t>
         <w:tab/>
-        <w:t>24</w:t>
+        <w:t>23</w:t>
       </w:r>
     </w:p>
     <w:p>
@@ -2398,7 +2398,7 @@
         </w:rPr>
         <w:t>5.4 系统管理模块的实现</w:t>
         <w:tab/>
-        <w:t>25</w:t>
+        <w:t>24</w:t>
       </w:r>
     </w:p>
     <w:p>
@@ -2418,7 +2418,7 @@
         </w:rPr>
         <w:t>5.4.1 学生管理页面</w:t>
         <w:tab/>
-        <w:t>25</w:t>
+        <w:t>24</w:t>
       </w:r>
     </w:p>
     <w:p>
@@ -2438,7 +2438,7 @@
         </w:rPr>
         <w:t>5.4.2 课程管理页面</w:t>
         <w:tab/>
-        <w:t>26</w:t>
+        <w:t>24</w:t>
       </w:r>
     </w:p>
     <w:p>
@@ -2458,7 +2458,7 @@
         </w:rPr>
         <w:t>5.4.3 教师管理页面</w:t>
         <w:tab/>
-        <w:t>27</w:t>
+        <w:t>25</w:t>
       </w:r>
     </w:p>
     <w:p>
@@ -2478,7 +2478,7 @@
         </w:rPr>
         <w:t>5.5 消息通知模块的实现</w:t>
         <w:tab/>
-        <w:t>28</w:t>
+        <w:t>26</w:t>
       </w:r>
     </w:p>
     <w:p>
@@ -2498,7 +2498,7 @@
         </w:rPr>
         <w:t>5.6 系统安全模块的实现</w:t>
         <w:tab/>
-        <w:t>29</w:t>
+        <w:t>27</w:t>
       </w:r>
     </w:p>
     <w:p>
@@ -2518,7 +2518,7 @@
         </w:rPr>
         <w:t>5.6.1 Sa-Token 登录与 Token 管理</w:t>
         <w:tab/>
-        <w:t>29</w:t>
+        <w:t>27</w:t>
       </w:r>
     </w:p>
     <w:p>
@@ -2538,7 +2538,7 @@
         </w:rPr>
         <w:t>5.6.2 网关层鉴权过滤器</w:t>
         <w:tab/>
-        <w:t>29</w:t>
+        <w:t>27</w:t>
       </w:r>
     </w:p>
     <w:p>
@@ -2558,7 +2558,7 @@
         </w:rPr>
         <w:t>5.7 本章小结</w:t>
         <w:tab/>
-        <w:t>30</w:t>
+        <w:t>28</w:t>
       </w:r>
     </w:p>
     <w:p>
@@ -2578,7 +2578,7 @@
         </w:rPr>
         <w:t>第 6 章 系统测试</w:t>
         <w:tab/>
-        <w:t>32</w:t>
+        <w:t>29</w:t>
       </w:r>
     </w:p>
     <w:p>
@@ -2598,7 +2598,7 @@
         </w:rPr>
         <w:t>6.1 测试设计</w:t>
         <w:tab/>
-        <w:t>32</w:t>
+        <w:t>29</w:t>
       </w:r>
     </w:p>
     <w:p>
@@ -2618,7 +2618,7 @@
         </w:rPr>
         <w:t>6.2 主要功能测试</w:t>
         <w:tab/>
-        <w:t>32</w:t>
+        <w:t>29</w:t>
       </w:r>
     </w:p>
     <w:p>
@@ -2638,7 +2638,7 @@
         </w:rPr>
         <w:t>6.2.1 系统安全功能测试</w:t>
         <w:tab/>
-        <w:t>32</w:t>
+        <w:t>29</w:t>
       </w:r>
     </w:p>
     <w:p>
@@ -2658,7 +2658,7 @@
         </w:rPr>
         <w:t>6.2.2 智能推荐功能测试</w:t>
         <w:tab/>
-        <w:t>32</w:t>
+        <w:t>29</w:t>
       </w:r>
     </w:p>
     <w:p>
@@ -2678,7 +2678,7 @@
         </w:rPr>
         <w:t>6.2.3 选课模块功能测试</w:t>
         <w:tab/>
-        <w:t>33</w:t>
+        <w:t>30</w:t>
       </w:r>
     </w:p>
     <w:p>
@@ -2698,7 +2698,7 @@
         </w:rPr>
         <w:t>6.2.4 冲突检测功能测试</w:t>
         <w:tab/>
-        <w:t>33</w:t>
+        <w:t>30</w:t>
       </w:r>
     </w:p>
     <w:p>
@@ -2718,7 +2718,7 @@
         </w:rPr>
         <w:t>6.2.5 系统管理模块功能测试</w:t>
         <w:tab/>
-        <w:t>34</w:t>
+        <w:t>31</w:t>
       </w:r>
     </w:p>
     <w:p>
@@ -2738,7 +2738,7 @@
         </w:rPr>
         <w:t>6.2.6 消息通知模块功能测试</w:t>
         <w:tab/>
-        <w:t>34</w:t>
+        <w:t>31</w:t>
       </w:r>
     </w:p>
     <w:p>
@@ -2758,7 +2758,7 @@
         </w:rPr>
         <w:t>6.3 性能压力测试</w:t>
         <w:tab/>
-        <w:t>34</w:t>
+        <w:t>31</w:t>
       </w:r>
     </w:p>
     <w:p>
@@ -2778,7 +2778,7 @@
         </w:rPr>
         <w:t>6.4 本章小结</w:t>
         <w:tab/>
-        <w:t>35</w:t>
+        <w:t>32</w:t>
       </w:r>
     </w:p>
     <w:p>
@@ -2798,7 +2798,7 @@
         </w:rPr>
         <w:t>第 7 章 总结与展望</w:t>
         <w:tab/>
-        <w:t>37</w:t>
+        <w:t>34</w:t>
       </w:r>
     </w:p>
     <w:p>
@@ -2818,7 +2818,7 @@
         </w:rPr>
         <w:t>7.1 总结</w:t>
         <w:tab/>
-        <w:t>37</w:t>
+        <w:t>34</w:t>
       </w:r>
     </w:p>
     <w:p>
@@ -2838,7 +2838,7 @@
         </w:rPr>
         <w:t>7.2 展望</w:t>
         <w:tab/>
-        <w:t>37</w:t>
+        <w:t>34</w:t>
       </w:r>
     </w:p>
     <w:p>
@@ -2858,7 +2858,7 @@
         </w:rPr>
         <w:t>参考文献</w:t>
         <w:tab/>
-        <w:t>39</w:t>
+        <w:t>36</w:t>
       </w:r>
     </w:p>
     <w:p>
@@ -2878,7 +2878,7 @@
         </w:rPr>
         <w:t>致谢</w:t>
         <w:tab/>
-        <w:t>40</w:t>
+        <w:t>37</w:t>
       </w:r>
     </w:p>
     <w:p>
@@ -3519,7 +3519,7 @@
           <w:sz w:val="24"/>
           <w:bCs w:val="0"/>
         </w:rPr>
-        <w:t>第五章系统详细设计与实现，以模块为单元通过核心代码解析与界面截图相结合的方式，系统性呈现六大模块的实现细节，验证各模块技术方案的可行性与功能完整性。</w:t>
+        <w:t>第五章系统详细设计与实现，以模块为单元通过实现流程说明与界面截图相结合的方式，系统性呈现六大模块的实现细节，验证各模块技术方案的可行性与功能完整性。</w:t>
       </w:r>
     </w:p>
     <w:p>
@@ -3762,7 +3762,7 @@
           <w:sz w:val="24"/>
           <w:bCs w:val="0"/>
         </w:rPr>
-        <w:t>Redisson是构建在Redis之上的Java分布式对象与服务框架，提供了RLock（分布式锁）、RSemaphore等高级并发原语。本系统在选课核心流程中使用RLock实现分布式锁，锁定键格式为"curriculum:_select_{curriculumId}"，通过tryLock(500ms等待, 5000ms租约)机制确保同一课程在任意时刻只有一个选课请求进入临界区执行库存扣减，从而降低并发超卖风险。</w:t>
+        <w:t>Redisson是构建在Redis之上的Java分布式对象与服务框架，提供了较为丰富的并发控制能力。本系统在选课核心流程中利用其分布式锁能力对课程维度的关键操作进行串行化控制，并设置锁等待时间与租约时间，以确保同一课程在同一时刻仅有一个请求进入库存扣减临界区，从而降低并发超卖风险。</w:t>
       </w:r>
     </w:p>
     <w:p>
@@ -3830,7 +3830,7 @@
           <w:sz w:val="24"/>
           <w:bCs w:val="0"/>
         </w:rPr>
-        <w:t>Sa-Token是一个轻量级Java权限认证框架，以简洁的API设计和开箱即用的功能特性著称，可通过数行代码完成登录认证、权限校验等操作[9]。本系统通过Sa-Token实现统一鉴权：用户登录后由StpUtil.login(userId)生成会话Token并结合Redis进行存储；网关层通过自定义SaReactorFilter拦截请求，对登录、注册等白名单接口放行，其余接口调用StpUtil.checkLogin()验证Token有效性。当前配置中Token有效期为30天，active-timeout为-1，整体策略更偏向于保证开发和演示阶段的登录连续性。</w:t>
+        <w:t>Sa-Token是一个轻量级Java权限认证框架，以简洁的API设计和开箱即用的功能特性著称，可较为便捷地完成登录认证与权限校验[9]。本系统通过Sa-Token实现统一鉴权：用户登录成功后由框架生成会话Token并结合Redis进行存储；网关层通过自定义鉴权过滤器拦截请求，对登录、注册等白名单接口放行，其余接口统一执行登录态校验。当前配置中Token有效期为30天，active-timeout为-1，整体策略更偏向于保证开发和演示阶段的登录连续性。</w:t>
       </w:r>
     </w:p>
     <w:p>
@@ -3864,7 +3864,7 @@
           <w:sz w:val="24"/>
           <w:bCs w:val="0"/>
         </w:rPr>
-        <w:t>MyBatis-Plus是在MyBatis基础上进行功能增强的ORM框架，提供了通用Mapper（BaseMapper&lt;T&gt;）、通用Service（IService&lt;T&gt;）、条件构造器（LambdaQueryWrapper）等特性，将单表CRUD操作的样板代码量减少80%以上。本系统全面采用MyBatis-Plus进行数据访问，通过@TableLogic注解结合is_delete字段实现逻辑删除，@TableField(fill=FieldFill.INSERT)注解自动填充create_time与update_time字段，规范化数据操作行为，大幅提升开发效率。</w:t>
+        <w:t>MyBatis-Plus是在MyBatis基础上进行功能增强的ORM框架，提供了通用Mapper、通用Service、条件构造器、逻辑删除与自动填充等特性，可显著减少单表CRUD操作中的样板代码。本系统全面采用MyBatis-Plus进行数据访问，通过逻辑删除机制管理is_delete字段，并利用自动填充能力维护create_time与update_time字段，从而规范化数据操作行为并提升开发效率。</w:t>
       </w:r>
     </w:p>
     <w:p>
@@ -11476,311 +11476,8 @@
           <w:sz w:val="24"/>
           <w:bCs w:val="0"/>
         </w:rPr>
-        <w:t>智能推荐的核心逻辑位于CourseRecommendationService类中。系统首先根据studentId查询学生专业信息，再通过OpenFeign调用选课微服务的分页接口获取按专业过滤的课程列表，并赋予90分；若专业匹配课程数量不足预设limit，则补充通用课程并赋予50分；最后对所有候选课程按得分降序排列，截取前limit条返回。主服务不单独维护课程数据副本，课程信息均由选课微服务实时提供，以保证数据一致性。核心代码如下。</w:t>
-      </w:r>
-    </w:p>
-    <w:p>
-      <w:pPr>
-        <w:spacing w:before="0" w:after="0" w:line="300" w:lineRule="exact"/>
-        <w:ind w:left="567"/>
-      </w:pPr>
-      <w:r>
-        <w:rPr>
-          <w:rFonts w:ascii="Courier New" w:hAnsi="Courier New" w:eastAsia="仿宋"/>
-          <w:sz w:val="18"/>
-        </w:rPr>
-        <w:t>public List&lt;CourseRecommendVO&gt; recommendCoursesForStudent(</w:t>
-      </w:r>
-    </w:p>
-    <w:p>
-      <w:pPr>
-        <w:spacing w:before="0" w:after="0" w:line="300" w:lineRule="exact"/>
-        <w:ind w:left="567"/>
-      </w:pPr>
-      <w:r>
-        <w:rPr>
-          <w:rFonts w:ascii="Courier New" w:hAnsi="Courier New" w:eastAsia="仿宋"/>
-          <w:sz w:val="18"/>
-        </w:rPr>
-        <w:t xml:space="preserve">        Long studentId, Integer limit) {</w:t>
-      </w:r>
-    </w:p>
-    <w:p>
-      <w:pPr>
-        <w:spacing w:before="0" w:after="0" w:line="300" w:lineRule="exact"/>
-        <w:ind w:left="567"/>
-      </w:pPr>
-      <w:r>
-        <w:rPr>
-          <w:rFonts w:ascii="Courier New" w:hAnsi="Courier New" w:eastAsia="仿宋"/>
-          <w:sz w:val="18"/>
-        </w:rPr>
-        <w:t xml:space="preserve">    if (limit == null || limit &lt;= 0) limit = 5;</w:t>
-      </w:r>
-    </w:p>
-    <w:p>
-      <w:pPr>
-        <w:spacing w:before="0" w:after="0" w:line="300" w:lineRule="exact"/>
-        <w:ind w:left="567"/>
-      </w:pPr>
-      <w:r>
-        <w:rPr>
-          <w:rFonts w:ascii="Courier New" w:hAnsi="Courier New" w:eastAsia="仿宋"/>
-          <w:sz w:val="18"/>
-        </w:rPr>
-        <w:t xml:space="preserve">    Student student = studentMapper.selectById(studentId);</w:t>
-      </w:r>
-    </w:p>
-    <w:p>
-      <w:pPr>
-        <w:spacing w:before="0" w:after="0" w:line="300" w:lineRule="exact"/>
-        <w:ind w:left="567"/>
-      </w:pPr>
-      <w:r>
-        <w:rPr>
-          <w:rFonts w:ascii="Courier New" w:hAnsi="Courier New" w:eastAsia="仿宋"/>
-          <w:sz w:val="18"/>
-        </w:rPr>
-        <w:t xml:space="preserve">    if (student == null) return Collections.emptyList();</w:t>
-      </w:r>
-    </w:p>
-    <w:p>
-      <w:pPr>
-        <w:spacing w:before="0" w:after="0" w:line="300" w:lineRule="exact"/>
-        <w:ind w:left="567"/>
-      </w:pPr>
-      <w:r>
-        <w:rPr>
-          <w:rFonts w:ascii="Courier New" w:hAnsi="Courier New" w:eastAsia="仿宋"/>
-          <w:sz w:val="18"/>
-        </w:rPr>
-      </w:r>
-    </w:p>
-    <w:p>
-      <w:pPr>
-        <w:spacing w:before="0" w:after="0" w:line="300" w:lineRule="exact"/>
-        <w:ind w:left="567"/>
-      </w:pPr>
-      <w:r>
-        <w:rPr>
-          <w:rFonts w:ascii="Courier New" w:hAnsi="Courier New" w:eastAsia="仿宋"/>
-          <w:sz w:val="18"/>
-        </w:rPr>
-        <w:t xml:space="preserve">    List&lt;CourseRecommendVO&gt; result = new ArrayList&lt;&gt;();</w:t>
-      </w:r>
-    </w:p>
-    <w:p>
-      <w:pPr>
-        <w:spacing w:before="0" w:after="0" w:line="300" w:lineRule="exact"/>
-        <w:ind w:left="567"/>
-      </w:pPr>
-      <w:r>
-        <w:rPr>
-          <w:rFonts w:ascii="Courier New" w:hAnsi="Courier New" w:eastAsia="仿宋"/>
-          <w:sz w:val="18"/>
-        </w:rPr>
-        <w:t xml:space="preserve">    // Step1: 按专业查询匹配课程 (推荐分 90.0)</w:t>
-      </w:r>
-    </w:p>
-    <w:p>
-      <w:pPr>
-        <w:spacing w:before="0" w:after="0" w:line="300" w:lineRule="exact"/>
-        <w:ind w:left="567"/>
-      </w:pPr>
-      <w:r>
-        <w:rPr>
-          <w:rFonts w:ascii="Courier New" w:hAnsi="Courier New" w:eastAsia="仿宋"/>
-          <w:sz w:val="18"/>
-        </w:rPr>
-        <w:t xml:space="preserve">    if (student.getMajor() != null) {</w:t>
-      </w:r>
-    </w:p>
-    <w:p>
-      <w:pPr>
-        <w:spacing w:before="0" w:after="0" w:line="300" w:lineRule="exact"/>
-        <w:ind w:left="567"/>
-      </w:pPr>
-      <w:r>
-        <w:rPr>
-          <w:rFonts w:ascii="Courier New" w:hAnsi="Courier New" w:eastAsia="仿宋"/>
-          <w:sz w:val="18"/>
-        </w:rPr>
-        <w:t xml:space="preserve">        params.put("major", student.getMajor());</w:t>
-      </w:r>
-    </w:p>
-    <w:p>
-      <w:pPr>
-        <w:spacing w:before="0" w:after="0" w:line="300" w:lineRule="exact"/>
-        <w:ind w:left="567"/>
-      </w:pPr>
-      <w:r>
-        <w:rPr>
-          <w:rFonts w:ascii="Courier New" w:hAnsi="Courier New" w:eastAsia="仿宋"/>
-          <w:sz w:val="18"/>
-        </w:rPr>
-        <w:t xml:space="preserve">        PageParam&lt;Curriculum&gt; majorPage = enrollmentClient.page(params);</w:t>
-      </w:r>
-    </w:p>
-    <w:p>
-      <w:pPr>
-        <w:spacing w:before="0" w:after="0" w:line="300" w:lineRule="exact"/>
-        <w:ind w:left="567"/>
-      </w:pPr>
-      <w:r>
-        <w:rPr>
-          <w:rFonts w:ascii="Courier New" w:hAnsi="Courier New" w:eastAsia="仿宋"/>
-          <w:sz w:val="18"/>
-        </w:rPr>
-        <w:t xml:space="preserve">        for (Curriculum c : majorPage.getRecords()) {</w:t>
-      </w:r>
-    </w:p>
-    <w:p>
-      <w:pPr>
-        <w:spacing w:before="0" w:after="0" w:line="300" w:lineRule="exact"/>
-        <w:ind w:left="567"/>
-      </w:pPr>
-      <w:r>
-        <w:rPr>
-          <w:rFonts w:ascii="Courier New" w:hAnsi="Courier New" w:eastAsia="仿宋"/>
-          <w:sz w:val="18"/>
-        </w:rPr>
-        <w:t xml:space="preserve">            CourseRecommendVO vo = buildVO(c, student.getMajor());</w:t>
-      </w:r>
-    </w:p>
-    <w:p>
-      <w:pPr>
-        <w:spacing w:before="0" w:after="0" w:line="300" w:lineRule="exact"/>
-        <w:ind w:left="567"/>
-      </w:pPr>
-      <w:r>
-        <w:rPr>
-          <w:rFonts w:ascii="Courier New" w:hAnsi="Courier New" w:eastAsia="仿宋"/>
-          <w:sz w:val="18"/>
-        </w:rPr>
-        <w:t xml:space="preserve">            vo.setRecommendScore(90.0);</w:t>
-      </w:r>
-    </w:p>
-    <w:p>
-      <w:pPr>
-        <w:spacing w:before="0" w:after="0" w:line="300" w:lineRule="exact"/>
-        <w:ind w:left="567"/>
-      </w:pPr>
-      <w:r>
-        <w:rPr>
-          <w:rFonts w:ascii="Courier New" w:hAnsi="Courier New" w:eastAsia="仿宋"/>
-          <w:sz w:val="18"/>
-        </w:rPr>
-        <w:t xml:space="preserve">            result.add(vo);</w:t>
-      </w:r>
-    </w:p>
-    <w:p>
-      <w:pPr>
-        <w:spacing w:before="0" w:after="0" w:line="300" w:lineRule="exact"/>
-        <w:ind w:left="567"/>
-      </w:pPr>
-      <w:r>
-        <w:rPr>
-          <w:rFonts w:ascii="Courier New" w:hAnsi="Courier New" w:eastAsia="仿宋"/>
-          <w:sz w:val="18"/>
-        </w:rPr>
-        <w:t xml:space="preserve">        }</w:t>
-      </w:r>
-    </w:p>
-    <w:p>
-      <w:pPr>
-        <w:spacing w:before="0" w:after="0" w:line="300" w:lineRule="exact"/>
-        <w:ind w:left="567"/>
-      </w:pPr>
-      <w:r>
-        <w:rPr>
-          <w:rFonts w:ascii="Courier New" w:hAnsi="Courier New" w:eastAsia="仿宋"/>
-          <w:sz w:val="18"/>
-        </w:rPr>
-        <w:t xml:space="preserve">    }</w:t>
-      </w:r>
-    </w:p>
-    <w:p>
-      <w:pPr>
-        <w:spacing w:before="0" w:after="0" w:line="300" w:lineRule="exact"/>
-        <w:ind w:left="567"/>
-      </w:pPr>
-      <w:r>
-        <w:rPr>
-          <w:rFonts w:ascii="Courier New" w:hAnsi="Courier New" w:eastAsia="仿宋"/>
-          <w:sz w:val="18"/>
-        </w:rPr>
-        <w:t xml:space="preserve">    // Step2: 不足时以通用选修补充（推荐分 50.0）</w:t>
-      </w:r>
-    </w:p>
-    <w:p>
-      <w:pPr>
-        <w:spacing w:before="0" w:after="0" w:line="300" w:lineRule="exact"/>
-        <w:ind w:left="567"/>
-      </w:pPr>
-      <w:r>
-        <w:rPr>
-          <w:rFonts w:ascii="Courier New" w:hAnsi="Courier New" w:eastAsia="仿宋"/>
-          <w:sz w:val="18"/>
-        </w:rPr>
-        <w:t xml:space="preserve">    // Step3: 按推荐分降序，截取前 limit 条返回</w:t>
-      </w:r>
-    </w:p>
-    <w:p>
-      <w:pPr>
-        <w:spacing w:before="0" w:after="0" w:line="300" w:lineRule="exact"/>
-        <w:ind w:left="567"/>
-      </w:pPr>
-      <w:r>
-        <w:rPr>
-          <w:rFonts w:ascii="Courier New" w:hAnsi="Courier New" w:eastAsia="仿宋"/>
-          <w:sz w:val="18"/>
-        </w:rPr>
-        <w:t xml:space="preserve">    result.sort(Comparator.comparing(</w:t>
-      </w:r>
-    </w:p>
-    <w:p>
-      <w:pPr>
-        <w:spacing w:before="0" w:after="0" w:line="300" w:lineRule="exact"/>
-        <w:ind w:left="567"/>
-      </w:pPr>
-      <w:r>
-        <w:rPr>
-          <w:rFonts w:ascii="Courier New" w:hAnsi="Courier New" w:eastAsia="仿宋"/>
-          <w:sz w:val="18"/>
-        </w:rPr>
-        <w:t xml:space="preserve">        CourseRecommendVO::getRecommendScore).reversed());</w:t>
-      </w:r>
-    </w:p>
-    <w:p>
-      <w:pPr>
-        <w:spacing w:before="0" w:after="0" w:line="300" w:lineRule="exact"/>
-        <w:ind w:left="567"/>
-      </w:pPr>
-      <w:r>
-        <w:rPr>
-          <w:rFonts w:ascii="Courier New" w:hAnsi="Courier New" w:eastAsia="仿宋"/>
-          <w:sz w:val="18"/>
-        </w:rPr>
-        <w:t xml:space="preserve">    return result.subList(0, Math.min(result.size(), limit));</w:t>
-      </w:r>
-    </w:p>
-    <w:p>
-      <w:pPr>
-        <w:spacing w:before="0" w:after="0" w:line="300" w:lineRule="exact"/>
-        <w:ind w:left="567"/>
-      </w:pPr>
-      <w:r>
-        <w:rPr>
-          <w:rFonts w:ascii="Courier New" w:hAnsi="Courier New" w:eastAsia="仿宋"/>
-          <w:sz w:val="18"/>
-        </w:rPr>
-        <w:t>}</w:t>
-      </w:r>
-    </w:p>
-    <w:p>
-      <w:pPr>
-        <w:spacing w:after="120"/>
-      </w:pPr>
+        <w:t>智能推荐的核心逻辑位于推荐服务层中。系统首先根据studentId查询学生专业信息，再通过OpenFeign调用选课微服务的分页接口获取按专业过滤的课程列表，并赋予90分；若专业匹配课程数量不足预设limit，则补充通用课程并赋予50分；最后对所有候选课程按得分降序排列，截取前limit条返回。主服务不单独维护课程数据副本，课程信息均由选课微服务实时提供，以保证数据一致性。其实现过程可概括为以下三个步骤：首先校验studentId与limit参数，若学生不存在则直接返回空列表；其次依据学生专业查询高相关课程，不足部分再以通用选修课程补足；最后按照推荐分值完成排序与截取，并封装推荐理由后返回前端。</w:t>
+      </w:r>
     </w:p>
     <w:p>
       <w:pPr>
@@ -11796,7 +11493,7 @@
           <w:sz w:val="24"/>
           <w:bCs w:val="0"/>
         </w:rPr>
-        <w:t>这段代码跨服务调用通过Feign完成，整个逻辑在Java端跑，不依赖外部模型服务。排序用的是Comparator.comparing结合reversed()，复杂度O(n log n)。高校场景下课程总量通常有限，这类基于规则的推荐方式能够在较低计算开销下给出稳定结果，也便于后续继续扩展更多推荐维度。</w:t>
+        <w:t>推荐流程通过Feign完成跨服务调用，整体逻辑在Java服务侧执行，不依赖外部模型服务。排序阶段采用比较器完成降序处理，算法复杂度为O(n log n)。高校场景下课程总量通常有限，这类基于规则的推荐方式能够在较低计算开销下给出稳定结果，也便于后续继续扩展更多推荐维度。</w:t>
       </w:r>
     </w:p>
     <w:p>
@@ -11937,481 +11634,8 @@
           <w:sz w:val="24"/>
           <w:bCs w:val="0"/>
         </w:rPr>
-        <w:t>选课的核心控制器位于EnrollmentController类中。为保证高并发场景下的处理稳定性，系统主要依赖三道防线：requestId处理日志记录状态、Redisson分布式锁防止并发超卖、库存校验作为兜底机制。完整核心代码如下。</w:t>
-      </w:r>
-    </w:p>
-    <w:p>
-      <w:pPr>
-        <w:spacing w:before="0" w:after="0" w:line="300" w:lineRule="exact"/>
-        <w:ind w:left="567"/>
-      </w:pPr>
-      <w:r>
-        <w:rPr>
-          <w:rFonts w:ascii="Courier New" w:hAnsi="Courier New" w:eastAsia="仿宋"/>
-          <w:sz w:val="18"/>
-        </w:rPr>
-        <w:t>@PostMapping("/select")</w:t>
-      </w:r>
-    </w:p>
-    <w:p>
-      <w:pPr>
-        <w:spacing w:before="0" w:after="0" w:line="300" w:lineRule="exact"/>
-        <w:ind w:left="567"/>
-      </w:pPr>
-      <w:r>
-        <w:rPr>
-          <w:rFonts w:ascii="Courier New" w:hAnsi="Courier New" w:eastAsia="仿宋"/>
-          <w:sz w:val="18"/>
-        </w:rPr>
-        <w:t>public String enrollStudentToCourse(Long studentId,</w:t>
-      </w:r>
-    </w:p>
-    <w:p>
-      <w:pPr>
-        <w:spacing w:before="0" w:after="0" w:line="300" w:lineRule="exact"/>
-        <w:ind w:left="567"/>
-      </w:pPr>
-      <w:r>
-        <w:rPr>
-          <w:rFonts w:ascii="Courier New" w:hAnsi="Courier New" w:eastAsia="仿宋"/>
-          <w:sz w:val="18"/>
-        </w:rPr>
-        <w:t xml:space="preserve">        Long curriculumId, Long requestId) {</w:t>
-      </w:r>
-    </w:p>
-    <w:p>
-      <w:pPr>
-        <w:spacing w:before="0" w:after="0" w:line="300" w:lineRule="exact"/>
-        <w:ind w:left="567"/>
-      </w:pPr>
-      <w:r>
-        <w:rPr>
-          <w:rFonts w:ascii="Courier New" w:hAnsi="Courier New" w:eastAsia="仿宋"/>
-          <w:sz w:val="18"/>
-        </w:rPr>
-        <w:t xml:space="preserve">    // 第一步：查询处理日志</w:t>
-      </w:r>
-    </w:p>
-    <w:p>
-      <w:pPr>
-        <w:spacing w:before="0" w:after="0" w:line="300" w:lineRule="exact"/>
-        <w:ind w:left="567"/>
-      </w:pPr>
-      <w:r>
-        <w:rPr>
-          <w:rFonts w:ascii="Courier New" w:hAnsi="Courier New" w:eastAsia="仿宋"/>
-          <w:sz w:val="18"/>
-        </w:rPr>
-        <w:t xml:space="preserve">    EnrollmentLog log = enrollmentLogService.getOne(</w:t>
-      </w:r>
-    </w:p>
-    <w:p>
-      <w:pPr>
-        <w:spacing w:before="0" w:after="0" w:line="300" w:lineRule="exact"/>
-        <w:ind w:left="567"/>
-      </w:pPr>
-      <w:r>
-        <w:rPr>
-          <w:rFonts w:ascii="Courier New" w:hAnsi="Courier New" w:eastAsia="仿宋"/>
-          <w:sz w:val="18"/>
-        </w:rPr>
-        <w:t xml:space="preserve">        new LambdaQueryWrapper&lt;EnrollmentLog&gt;()</w:t>
-      </w:r>
-    </w:p>
-    <w:p>
-      <w:pPr>
-        <w:spacing w:before="0" w:after="0" w:line="300" w:lineRule="exact"/>
-        <w:ind w:left="567"/>
-      </w:pPr>
-      <w:r>
-        <w:rPr>
-          <w:rFonts w:ascii="Courier New" w:hAnsi="Courier New" w:eastAsia="仿宋"/>
-          <w:sz w:val="18"/>
-        </w:rPr>
-        <w:t xml:space="preserve">            .eq(EnrollmentLog::getRequestId, requestId));</w:t>
-      </w:r>
-    </w:p>
-    <w:p>
-      <w:pPr>
-        <w:spacing w:before="0" w:after="0" w:line="300" w:lineRule="exact"/>
-        <w:ind w:left="567"/>
-      </w:pPr>
-      <w:r>
-        <w:rPr>
-          <w:rFonts w:ascii="Courier New" w:hAnsi="Courier New" w:eastAsia="仿宋"/>
-          <w:sz w:val="18"/>
-        </w:rPr>
-        <w:t xml:space="preserve">    if (log != null) {</w:t>
-      </w:r>
-    </w:p>
-    <w:p>
-      <w:pPr>
-        <w:spacing w:before="0" w:after="0" w:line="300" w:lineRule="exact"/>
-        <w:ind w:left="567"/>
-      </w:pPr>
-      <w:r>
-        <w:rPr>
-          <w:rFonts w:ascii="Courier New" w:hAnsi="Courier New" w:eastAsia="仿宋"/>
-          <w:sz w:val="18"/>
-        </w:rPr>
-        <w:t xml:space="preserve">        return log.getStatus()==1 ? "已经选课成功" : "系统繁忙,请稍后重试";</w:t>
-      </w:r>
-    </w:p>
-    <w:p>
-      <w:pPr>
-        <w:spacing w:before="0" w:after="0" w:line="300" w:lineRule="exact"/>
-        <w:ind w:left="567"/>
-      </w:pPr>
-      <w:r>
-        <w:rPr>
-          <w:rFonts w:ascii="Courier New" w:hAnsi="Courier New" w:eastAsia="仿宋"/>
-          <w:sz w:val="18"/>
-        </w:rPr>
-        <w:t xml:space="preserve">    }</w:t>
-      </w:r>
-    </w:p>
-    <w:p>
-      <w:pPr>
-        <w:spacing w:before="0" w:after="0" w:line="300" w:lineRule="exact"/>
-        <w:ind w:left="567"/>
-      </w:pPr>
-      <w:r>
-        <w:rPr>
-          <w:rFonts w:ascii="Courier New" w:hAnsi="Courier New" w:eastAsia="仿宋"/>
-          <w:sz w:val="18"/>
-        </w:rPr>
-        <w:t xml:space="preserve">    // 第二步：获取 Redisson 分布式锁</w:t>
-      </w:r>
-    </w:p>
-    <w:p>
-      <w:pPr>
-        <w:spacing w:before="0" w:after="0" w:line="300" w:lineRule="exact"/>
-        <w:ind w:left="567"/>
-      </w:pPr>
-      <w:r>
-        <w:rPr>
-          <w:rFonts w:ascii="Courier New" w:hAnsi="Courier New" w:eastAsia="仿宋"/>
-          <w:sz w:val="18"/>
-        </w:rPr>
-        <w:t xml:space="preserve">    RLock lock = redissonClient.getLock(</w:t>
-      </w:r>
-    </w:p>
-    <w:p>
-      <w:pPr>
-        <w:spacing w:before="0" w:after="0" w:line="300" w:lineRule="exact"/>
-        <w:ind w:left="567"/>
-      </w:pPr>
-      <w:r>
-        <w:rPr>
-          <w:rFonts w:ascii="Courier New" w:hAnsi="Courier New" w:eastAsia="仿宋"/>
-          <w:sz w:val="18"/>
-        </w:rPr>
-        <w:t xml:space="preserve">        "curriculum:_select_" + curriculumId);</w:t>
-      </w:r>
-    </w:p>
-    <w:p>
-      <w:pPr>
-        <w:spacing w:before="0" w:after="0" w:line="300" w:lineRule="exact"/>
-        <w:ind w:left="567"/>
-      </w:pPr>
-      <w:r>
-        <w:rPr>
-          <w:rFonts w:ascii="Courier New" w:hAnsi="Courier New" w:eastAsia="仿宋"/>
-          <w:sz w:val="18"/>
-        </w:rPr>
-        <w:t xml:space="preserve">    try {</w:t>
-      </w:r>
-    </w:p>
-    <w:p>
-      <w:pPr>
-        <w:spacing w:before="0" w:after="0" w:line="300" w:lineRule="exact"/>
-        <w:ind w:left="567"/>
-      </w:pPr>
-      <w:r>
-        <w:rPr>
-          <w:rFonts w:ascii="Courier New" w:hAnsi="Courier New" w:eastAsia="仿宋"/>
-          <w:sz w:val="18"/>
-        </w:rPr>
-        <w:t xml:space="preserve">        boolean locked = lock.tryLock(500, 5000, TimeUnit.MILLISECONDS);</w:t>
-      </w:r>
-    </w:p>
-    <w:p>
-      <w:pPr>
-        <w:spacing w:before="0" w:after="0" w:line="300" w:lineRule="exact"/>
-        <w:ind w:left="567"/>
-      </w:pPr>
-      <w:r>
-        <w:rPr>
-          <w:rFonts w:ascii="Courier New" w:hAnsi="Courier New" w:eastAsia="仿宋"/>
-          <w:sz w:val="18"/>
-        </w:rPr>
-        <w:t xml:space="preserve">        if (locked) {</w:t>
-      </w:r>
-    </w:p>
-    <w:p>
-      <w:pPr>
-        <w:spacing w:before="0" w:after="0" w:line="300" w:lineRule="exact"/>
-        <w:ind w:left="567"/>
-      </w:pPr>
-      <w:r>
-        <w:rPr>
-          <w:rFonts w:ascii="Courier New" w:hAnsi="Courier New" w:eastAsia="仿宋"/>
-          <w:sz w:val="18"/>
-        </w:rPr>
-        <w:t xml:space="preserve">            Curriculum c = curriculumService.getOne(...);</w:t>
-      </w:r>
-    </w:p>
-    <w:p>
-      <w:pPr>
-        <w:spacing w:before="0" w:after="0" w:line="300" w:lineRule="exact"/>
-        <w:ind w:left="567"/>
-      </w:pPr>
-      <w:r>
-        <w:rPr>
-          <w:rFonts w:ascii="Courier New" w:hAnsi="Courier New" w:eastAsia="仿宋"/>
-          <w:sz w:val="18"/>
-        </w:rPr>
-        <w:t xml:space="preserve">            if (c.getStock() &lt;= 0) return "选课失败,该课程人数已满";</w:t>
-      </w:r>
-    </w:p>
-    <w:p>
-      <w:pPr>
-        <w:spacing w:before="0" w:after="0" w:line="300" w:lineRule="exact"/>
-        <w:ind w:left="567"/>
-      </w:pPr>
-      <w:r>
-        <w:rPr>
-          <w:rFonts w:ascii="Courier New" w:hAnsi="Courier New" w:eastAsia="仿宋"/>
-          <w:sz w:val="18"/>
-        </w:rPr>
-        <w:t xml:space="preserve">            if (enrollmentService.getOne(...) != null)</w:t>
-      </w:r>
-    </w:p>
-    <w:p>
-      <w:pPr>
-        <w:spacing w:before="0" w:after="0" w:line="300" w:lineRule="exact"/>
-        <w:ind w:left="567"/>
-      </w:pPr>
-      <w:r>
-        <w:rPr>
-          <w:rFonts w:ascii="Courier New" w:hAnsi="Courier New" w:eastAsia="仿宋"/>
-          <w:sz w:val="18"/>
-        </w:rPr>
-        <w:t xml:space="preserve">                return "选课失败，你已经选过该课程";</w:t>
-      </w:r>
-    </w:p>
-    <w:p>
-      <w:pPr>
-        <w:spacing w:before="0" w:after="0" w:line="300" w:lineRule="exact"/>
-        <w:ind w:left="567"/>
-      </w:pPr>
-      <w:r>
-        <w:rPr>
-          <w:rFonts w:ascii="Courier New" w:hAnsi="Courier New" w:eastAsia="仿宋"/>
-          <w:sz w:val="18"/>
-        </w:rPr>
-        <w:t xml:space="preserve">            EnrollmentLog newLog = new EnrollmentLog();</w:t>
-      </w:r>
-    </w:p>
-    <w:p>
-      <w:pPr>
-        <w:spacing w:before="0" w:after="0" w:line="300" w:lineRule="exact"/>
-        <w:ind w:left="567"/>
-      </w:pPr>
-      <w:r>
-        <w:rPr>
-          <w:rFonts w:ascii="Courier New" w:hAnsi="Courier New" w:eastAsia="仿宋"/>
-          <w:sz w:val="18"/>
-        </w:rPr>
-        <w:t xml:space="preserve">            newLog.setRequestId(requestId);</w:t>
-      </w:r>
-    </w:p>
-    <w:p>
-      <w:pPr>
-        <w:spacing w:before="0" w:after="0" w:line="300" w:lineRule="exact"/>
-        <w:ind w:left="567"/>
-      </w:pPr>
-      <w:r>
-        <w:rPr>
-          <w:rFonts w:ascii="Courier New" w:hAnsi="Courier New" w:eastAsia="仿宋"/>
-          <w:sz w:val="18"/>
-        </w:rPr>
-        <w:t xml:space="preserve">            newLog.setStudentId(studentId);</w:t>
-      </w:r>
-    </w:p>
-    <w:p>
-      <w:pPr>
-        <w:spacing w:before="0" w:after="0" w:line="300" w:lineRule="exact"/>
-        <w:ind w:left="567"/>
-      </w:pPr>
-      <w:r>
-        <w:rPr>
-          <w:rFonts w:ascii="Courier New" w:hAnsi="Courier New" w:eastAsia="仿宋"/>
-          <w:sz w:val="18"/>
-        </w:rPr>
-        <w:t xml:space="preserve">            newLog.setStatus(0);</w:t>
-      </w:r>
-    </w:p>
-    <w:p>
-      <w:pPr>
-        <w:spacing w:before="0" w:after="0" w:line="300" w:lineRule="exact"/>
-        <w:ind w:left="567"/>
-      </w:pPr>
-      <w:r>
-        <w:rPr>
-          <w:rFonts w:ascii="Courier New" w:hAnsi="Courier New" w:eastAsia="仿宋"/>
-          <w:sz w:val="18"/>
-        </w:rPr>
-        <w:t xml:space="preserve">            enrollmentLogService.save(newLog);</w:t>
-      </w:r>
-    </w:p>
-    <w:p>
-      <w:pPr>
-        <w:spacing w:before="0" w:after="0" w:line="300" w:lineRule="exact"/>
-        <w:ind w:left="567"/>
-      </w:pPr>
-      <w:r>
-        <w:rPr>
-          <w:rFonts w:ascii="Courier New" w:hAnsi="Courier New" w:eastAsia="仿宋"/>
-          <w:sz w:val="18"/>
-        </w:rPr>
-        <w:t xml:space="preserve">            return enrollmentService.enrollStudentToCourse(</w:t>
-      </w:r>
-    </w:p>
-    <w:p>
-      <w:pPr>
-        <w:spacing w:before="0" w:after="0" w:line="300" w:lineRule="exact"/>
-        <w:ind w:left="567"/>
-      </w:pPr>
-      <w:r>
-        <w:rPr>
-          <w:rFonts w:ascii="Courier New" w:hAnsi="Courier New" w:eastAsia="仿宋"/>
-          <w:sz w:val="18"/>
-        </w:rPr>
-        <w:t xml:space="preserve">                studentId, c, newLog);</w:t>
-      </w:r>
-    </w:p>
-    <w:p>
-      <w:pPr>
-        <w:spacing w:before="0" w:after="0" w:line="300" w:lineRule="exact"/>
-        <w:ind w:left="567"/>
-      </w:pPr>
-      <w:r>
-        <w:rPr>
-          <w:rFonts w:ascii="Courier New" w:hAnsi="Courier New" w:eastAsia="仿宋"/>
-          <w:sz w:val="18"/>
-        </w:rPr>
-        <w:t xml:space="preserve">        }</w:t>
-      </w:r>
-    </w:p>
-    <w:p>
-      <w:pPr>
-        <w:spacing w:before="0" w:after="0" w:line="300" w:lineRule="exact"/>
-        <w:ind w:left="567"/>
-      </w:pPr>
-      <w:r>
-        <w:rPr>
-          <w:rFonts w:ascii="Courier New" w:hAnsi="Courier New" w:eastAsia="仿宋"/>
-          <w:sz w:val="18"/>
-        </w:rPr>
-        <w:t xml:space="preserve">        return "系统繁忙，请稍后再试";</w:t>
-      </w:r>
-    </w:p>
-    <w:p>
-      <w:pPr>
-        <w:spacing w:before="0" w:after="0" w:line="300" w:lineRule="exact"/>
-        <w:ind w:left="567"/>
-      </w:pPr>
-      <w:r>
-        <w:rPr>
-          <w:rFonts w:ascii="Courier New" w:hAnsi="Courier New" w:eastAsia="仿宋"/>
-          <w:sz w:val="18"/>
-        </w:rPr>
-        <w:t xml:space="preserve">    } catch (InterruptedException e) {</w:t>
-      </w:r>
-    </w:p>
-    <w:p>
-      <w:pPr>
-        <w:spacing w:before="0" w:after="0" w:line="300" w:lineRule="exact"/>
-        <w:ind w:left="567"/>
-      </w:pPr>
-      <w:r>
-        <w:rPr>
-          <w:rFonts w:ascii="Courier New" w:hAnsi="Courier New" w:eastAsia="仿宋"/>
-          <w:sz w:val="18"/>
-        </w:rPr>
-        <w:t xml:space="preserve">        Thread.currentThread().interrupt();</w:t>
-      </w:r>
-    </w:p>
-    <w:p>
-      <w:pPr>
-        <w:spacing w:before="0" w:after="0" w:line="300" w:lineRule="exact"/>
-        <w:ind w:left="567"/>
-      </w:pPr>
-      <w:r>
-        <w:rPr>
-          <w:rFonts w:ascii="Courier New" w:hAnsi="Courier New" w:eastAsia="仿宋"/>
-          <w:sz w:val="18"/>
-        </w:rPr>
-        <w:t xml:space="preserve">        return "服务器出了点小差，请稍后再试";</w:t>
-      </w:r>
-    </w:p>
-    <w:p>
-      <w:pPr>
-        <w:spacing w:before="0" w:after="0" w:line="300" w:lineRule="exact"/>
-        <w:ind w:left="567"/>
-      </w:pPr>
-      <w:r>
-        <w:rPr>
-          <w:rFonts w:ascii="Courier New" w:hAnsi="Courier New" w:eastAsia="仿宋"/>
-          <w:sz w:val="18"/>
-        </w:rPr>
-        <w:t xml:space="preserve">    } finally {</w:t>
-      </w:r>
-    </w:p>
-    <w:p>
-      <w:pPr>
-        <w:spacing w:before="0" w:after="0" w:line="300" w:lineRule="exact"/>
-        <w:ind w:left="567"/>
-      </w:pPr>
-      <w:r>
-        <w:rPr>
-          <w:rFonts w:ascii="Courier New" w:hAnsi="Courier New" w:eastAsia="仿宋"/>
-          <w:sz w:val="18"/>
-        </w:rPr>
-        <w:t xml:space="preserve">        if (lock.isHeldByCurrentThread()) lock.unlock();</w:t>
-      </w:r>
-    </w:p>
-    <w:p>
-      <w:pPr>
-        <w:spacing w:before="0" w:after="0" w:line="300" w:lineRule="exact"/>
-        <w:ind w:left="567"/>
-      </w:pPr>
-      <w:r>
-        <w:rPr>
-          <w:rFonts w:ascii="Courier New" w:hAnsi="Courier New" w:eastAsia="仿宋"/>
-          <w:sz w:val="18"/>
-        </w:rPr>
-        <w:t xml:space="preserve">    }</w:t>
-      </w:r>
-    </w:p>
-    <w:p>
-      <w:pPr>
-        <w:spacing w:before="0" w:after="0" w:line="300" w:lineRule="exact"/>
-        <w:ind w:left="567"/>
-      </w:pPr>
-      <w:r>
-        <w:rPr>
-          <w:rFonts w:ascii="Courier New" w:hAnsi="Courier New" w:eastAsia="仿宋"/>
-          <w:sz w:val="18"/>
-        </w:rPr>
-        <w:t>}</w:t>
-      </w:r>
-    </w:p>
-    <w:p>
-      <w:pPr>
-        <w:spacing w:after="120"/>
-      </w:pPr>
+        <w:t>选课的核心控制逻辑位于选课微服务控制层。为保证高并发场景下的处理稳定性，系统主要依赖三道防线：requestId处理日志记录状态、Redisson分布式锁防止并发超卖、库存校验作为兜底机制。该控制逻辑可以概括为：首先依据requestId查询enrollment_log，判断当前请求是否已有处理记录；其次基于课程ID尝试获取分布式锁，并在持锁状态下完成库存校验与重复选课校验；最后在条件满足时写入处理日志、调用选课服务完成入库与扣减库存，并在释放锁后将结果返回给上层调用方。</w:t>
+      </w:r>
     </w:p>
     <w:p>
       <w:pPr>
@@ -12427,7 +11651,7 @@
           <w:sz w:val="24"/>
           <w:bCs w:val="0"/>
         </w:rPr>
-        <w:t>tryLock(500, 5000, TimeUnit.MILLISECONDS)的参数含义：500ms为最长等待获取锁的时间，超时则放弃并返回"系统繁忙"；5000ms为锁的自动释放时间（租约），防止持锁服务崩溃后长期占锁。这里的requestId并不是前端直接传入的业务参数，而是异步消费者在调用选课微服务前生成的内部处理标识，并同步写入enrollment_log用于记录本次处理状态。主业务服务通过rabbitTemplate.convertAndSend()将EnrollmentDTO发送至RabbitMQ队列实现异步处理，前端在收到"处理中"响应后展示等待提示，选课结果在0至5分钟内通过消息中心通知学生。</w:t>
+        <w:t>分布式锁的等待时间设置为500ms，锁租约时间设置为5000ms，前者用于限制抢锁等待时长，后者用于避免服务异常时长期占锁。这里的requestId并不是前端直接传入的业务参数，而是异步消费者在调用选课微服务前生成的内部处理标识，并同步写入enrollment_log用于记录本次处理状态。主业务服务通过消息发送组件将EnrollmentDTO投递至RabbitMQ队列实现异步处理，前端在收到"处理中"响应后展示等待提示，选课结果在0至5分钟内通过消息中心通知学生。</w:t>
       </w:r>
     </w:p>
     <w:p>
@@ -12804,295 +12028,8 @@
           <w:sz w:val="24"/>
           <w:bCs w:val="0"/>
         </w:rPr>
-        <w:t>冲突检测核心实现位于CourseConflictServiceImpl类的isTimeConflict方法。该方法通过时间区间扩展与三条件交叉判断，对课程时间重叠的主要场景进行预警。完整代码如下。</w:t>
-      </w:r>
-    </w:p>
-    <w:p>
-      <w:pPr>
-        <w:spacing w:before="0" w:after="0" w:line="300" w:lineRule="exact"/>
-        <w:ind w:left="567"/>
-      </w:pPr>
-      <w:r>
-        <w:rPr>
-          <w:rFonts w:ascii="Courier New" w:hAnsi="Courier New" w:eastAsia="仿宋"/>
-          <w:sz w:val="18"/>
-        </w:rPr>
-        <w:t>private static final long CONFLICT_THRESHOLD_MINUTES = 15;</w:t>
-      </w:r>
-    </w:p>
-    <w:p>
-      <w:pPr>
-        <w:spacing w:before="0" w:after="0" w:line="300" w:lineRule="exact"/>
-        <w:ind w:left="567"/>
-      </w:pPr>
-      <w:r>
-        <w:rPr>
-          <w:rFonts w:ascii="Courier New" w:hAnsi="Courier New" w:eastAsia="仿宋"/>
-          <w:sz w:val="18"/>
-        </w:rPr>
-      </w:r>
-    </w:p>
-    <w:p>
-      <w:pPr>
-        <w:spacing w:before="0" w:after="0" w:line="300" w:lineRule="exact"/>
-        <w:ind w:left="567"/>
-      </w:pPr>
-      <w:r>
-        <w:rPr>
-          <w:rFonts w:ascii="Courier New" w:hAnsi="Courier New" w:eastAsia="仿宋"/>
-          <w:sz w:val="18"/>
-        </w:rPr>
-        <w:t>@Override</w:t>
-      </w:r>
-    </w:p>
-    <w:p>
-      <w:pPr>
-        <w:spacing w:before="0" w:after="0" w:line="300" w:lineRule="exact"/>
-        <w:ind w:left="567"/>
-      </w:pPr>
-      <w:r>
-        <w:rPr>
-          <w:rFonts w:ascii="Courier New" w:hAnsi="Courier New" w:eastAsia="仿宋"/>
-          <w:sz w:val="18"/>
-        </w:rPr>
-        <w:t>public boolean isTimeConflict(Curriculum c1, Curriculum c2) {</w:t>
-      </w:r>
-    </w:p>
-    <w:p>
-      <w:pPr>
-        <w:spacing w:before="0" w:after="0" w:line="300" w:lineRule="exact"/>
-        <w:ind w:left="567"/>
-      </w:pPr>
-      <w:r>
-        <w:rPr>
-          <w:rFonts w:ascii="Courier New" w:hAnsi="Courier New" w:eastAsia="仿宋"/>
-          <w:sz w:val="18"/>
-        </w:rPr>
-        <w:t xml:space="preserve">    Date t1 = c1.getTeachingTime();</w:t>
-      </w:r>
-    </w:p>
-    <w:p>
-      <w:pPr>
-        <w:spacing w:before="0" w:after="0" w:line="300" w:lineRule="exact"/>
-        <w:ind w:left="567"/>
-      </w:pPr>
-      <w:r>
-        <w:rPr>
-          <w:rFonts w:ascii="Courier New" w:hAnsi="Courier New" w:eastAsia="仿宋"/>
-          <w:sz w:val="18"/>
-        </w:rPr>
-        <w:t xml:space="preserve">    Date t2 = c2.getTeachingTime();</w:t>
-      </w:r>
-    </w:p>
-    <w:p>
-      <w:pPr>
-        <w:spacing w:before="0" w:after="0" w:line="300" w:lineRule="exact"/>
-        <w:ind w:left="567"/>
-      </w:pPr>
-      <w:r>
-        <w:rPr>
-          <w:rFonts w:ascii="Courier New" w:hAnsi="Courier New" w:eastAsia="仿宋"/>
-          <w:sz w:val="18"/>
-        </w:rPr>
-        <w:t xml:space="preserve">    if (t1 == null || t2 == null) return false;</w:t>
-      </w:r>
-    </w:p>
-    <w:p>
-      <w:pPr>
-        <w:spacing w:before="0" w:after="0" w:line="300" w:lineRule="exact"/>
-        <w:ind w:left="567"/>
-      </w:pPr>
-      <w:r>
-        <w:rPr>
-          <w:rFonts w:ascii="Courier New" w:hAnsi="Courier New" w:eastAsia="仿宋"/>
-          <w:sz w:val="18"/>
-        </w:rPr>
-      </w:r>
-    </w:p>
-    <w:p>
-      <w:pPr>
-        <w:spacing w:before="0" w:after="0" w:line="300" w:lineRule="exact"/>
-        <w:ind w:left="567"/>
-      </w:pPr>
-      <w:r>
-        <w:rPr>
-          <w:rFonts w:ascii="Courier New" w:hAnsi="Courier New" w:eastAsia="仿宋"/>
-          <w:sz w:val="18"/>
-        </w:rPr>
-        <w:t xml:space="preserve">    long duration = TimeUnit.HOURS.toMillis(2); // 课时2小时</w:t>
-      </w:r>
-    </w:p>
-    <w:p>
-      <w:pPr>
-        <w:spacing w:before="0" w:after="0" w:line="300" w:lineRule="exact"/>
-        <w:ind w:left="567"/>
-      </w:pPr>
-      <w:r>
-        <w:rPr>
-          <w:rFonts w:ascii="Courier New" w:hAnsi="Courier New" w:eastAsia="仿宋"/>
-          <w:sz w:val="18"/>
-        </w:rPr>
-        <w:t xml:space="preserve">    Date end1 = new Date(t1.getTime() + duration);</w:t>
-      </w:r>
-    </w:p>
-    <w:p>
-      <w:pPr>
-        <w:spacing w:before="0" w:after="0" w:line="300" w:lineRule="exact"/>
-        <w:ind w:left="567"/>
-      </w:pPr>
-      <w:r>
-        <w:rPr>
-          <w:rFonts w:ascii="Courier New" w:hAnsi="Courier New" w:eastAsia="仿宋"/>
-          <w:sz w:val="18"/>
-        </w:rPr>
-        <w:t xml:space="preserve">    Date end2 = new Date(t2.getTime() + duration);</w:t>
-      </w:r>
-    </w:p>
-    <w:p>
-      <w:pPr>
-        <w:spacing w:before="0" w:after="0" w:line="300" w:lineRule="exact"/>
-        <w:ind w:left="567"/>
-      </w:pPr>
-      <w:r>
-        <w:rPr>
-          <w:rFonts w:ascii="Courier New" w:hAnsi="Courier New" w:eastAsia="仿宋"/>
-          <w:sz w:val="18"/>
-        </w:rPr>
-      </w:r>
-    </w:p>
-    <w:p>
-      <w:pPr>
-        <w:spacing w:before="0" w:after="0" w:line="300" w:lineRule="exact"/>
-        <w:ind w:left="567"/>
-      </w:pPr>
-      <w:r>
-        <w:rPr>
-          <w:rFonts w:ascii="Courier New" w:hAnsi="Courier New" w:eastAsia="仿宋"/>
-          <w:sz w:val="18"/>
-        </w:rPr>
-        <w:t xml:space="preserve">    // 对 c1 的区间两端各扩展 15 分钟缓冲</w:t>
-      </w:r>
-    </w:p>
-    <w:p>
-      <w:pPr>
-        <w:spacing w:before="0" w:after="0" w:line="300" w:lineRule="exact"/>
-        <w:ind w:left="567"/>
-      </w:pPr>
-      <w:r>
-        <w:rPr>
-          <w:rFonts w:ascii="Courier New" w:hAnsi="Courier New" w:eastAsia="仿宋"/>
-          <w:sz w:val="18"/>
-        </w:rPr>
-        <w:t xml:space="preserve">    long buf = TimeUnit.MINUTES.toMillis(CONFLICT_THRESHOLD_MINUTES);</w:t>
-      </w:r>
-    </w:p>
-    <w:p>
-      <w:pPr>
-        <w:spacing w:before="0" w:after="0" w:line="300" w:lineRule="exact"/>
-        <w:ind w:left="567"/>
-      </w:pPr>
-      <w:r>
-        <w:rPr>
-          <w:rFonts w:ascii="Courier New" w:hAnsi="Courier New" w:eastAsia="仿宋"/>
-          <w:sz w:val="18"/>
-        </w:rPr>
-        <w:t xml:space="preserve">    Date adjStart1 = new Date(t1.getTime() - buf);</w:t>
-      </w:r>
-    </w:p>
-    <w:p>
-      <w:pPr>
-        <w:spacing w:before="0" w:after="0" w:line="300" w:lineRule="exact"/>
-        <w:ind w:left="567"/>
-      </w:pPr>
-      <w:r>
-        <w:rPr>
-          <w:rFonts w:ascii="Courier New" w:hAnsi="Courier New" w:eastAsia="仿宋"/>
-          <w:sz w:val="18"/>
-        </w:rPr>
-        <w:t xml:space="preserve">    Date adjEnd1   = new Date(end1.getTime() + buf);</w:t>
-      </w:r>
-    </w:p>
-    <w:p>
-      <w:pPr>
-        <w:spacing w:before="0" w:after="0" w:line="300" w:lineRule="exact"/>
-        <w:ind w:left="567"/>
-      </w:pPr>
-      <w:r>
-        <w:rPr>
-          <w:rFonts w:ascii="Courier New" w:hAnsi="Courier New" w:eastAsia="仿宋"/>
-          <w:sz w:val="18"/>
-        </w:rPr>
-      </w:r>
-    </w:p>
-    <w:p>
-      <w:pPr>
-        <w:spacing w:before="0" w:after="0" w:line="300" w:lineRule="exact"/>
-        <w:ind w:left="567"/>
-      </w:pPr>
-      <w:r>
-        <w:rPr>
-          <w:rFonts w:ascii="Courier New" w:hAnsi="Courier New" w:eastAsia="仿宋"/>
-          <w:sz w:val="18"/>
-        </w:rPr>
-        <w:t xml:space="preserve">    // 三条件覆盖所有时间重叠场景</w:t>
-      </w:r>
-    </w:p>
-    <w:p>
-      <w:pPr>
-        <w:spacing w:before="0" w:after="0" w:line="300" w:lineRule="exact"/>
-        <w:ind w:left="567"/>
-      </w:pPr>
-      <w:r>
-        <w:rPr>
-          <w:rFonts w:ascii="Courier New" w:hAnsi="Courier New" w:eastAsia="仿宋"/>
-          <w:sz w:val="18"/>
-        </w:rPr>
-        <w:t xml:space="preserve">    return (t2.after(adjStart1)   &amp;&amp; t2.before(adjEnd1))</w:t>
-      </w:r>
-    </w:p>
-    <w:p>
-      <w:pPr>
-        <w:spacing w:before="0" w:after="0" w:line="300" w:lineRule="exact"/>
-        <w:ind w:left="567"/>
-      </w:pPr>
-      <w:r>
-        <w:rPr>
-          <w:rFonts w:ascii="Courier New" w:hAnsi="Courier New" w:eastAsia="仿宋"/>
-          <w:sz w:val="18"/>
-        </w:rPr>
-        <w:t xml:space="preserve">        || (end2.after(adjStart1) &amp;&amp; end2.before(adjEnd1))</w:t>
-      </w:r>
-    </w:p>
-    <w:p>
-      <w:pPr>
-        <w:spacing w:before="0" w:after="0" w:line="300" w:lineRule="exact"/>
-        <w:ind w:left="567"/>
-      </w:pPr>
-      <w:r>
-        <w:rPr>
-          <w:rFonts w:ascii="Courier New" w:hAnsi="Courier New" w:eastAsia="仿宋"/>
-          <w:sz w:val="18"/>
-        </w:rPr>
-        <w:t xml:space="preserve">        || (t2.before(adjStart1)  &amp;&amp; end2.after(adjEnd1));</w:t>
-      </w:r>
-    </w:p>
-    <w:p>
-      <w:pPr>
-        <w:spacing w:before="0" w:after="0" w:line="300" w:lineRule="exact"/>
-        <w:ind w:left="567"/>
-      </w:pPr>
-      <w:r>
-        <w:rPr>
-          <w:rFonts w:ascii="Courier New" w:hAnsi="Courier New" w:eastAsia="仿宋"/>
-          <w:sz w:val="18"/>
-        </w:rPr>
-        <w:t>}</w:t>
-      </w:r>
-    </w:p>
-    <w:p>
-      <w:pPr>
-        <w:spacing w:after="120"/>
-      </w:pPr>
+        <w:t>冲突检测核心实现位于冲突检测服务的时间判断逻辑中。该逻辑通过时间区间扩展与三条件交叉判断，对课程时间重叠的主要场景进行预警。具体而言，系统首先读取两门课程的授课时间，并以2小时作为默认课时长度计算结束时间；随后在目标课程开始与结束时间两端各扩展15分钟，形成带缓冲的判断区间；最后分别从"开始时间落入区间""结束时间落入区间"以及"整体时间完全覆盖区间"三个角度判断是否构成冲突。</w:t>
+      </w:r>
     </w:p>
     <w:p>
       <w:pPr>
@@ -13626,260 +12563,8 @@
           <w:sz w:val="24"/>
           <w:bCs w:val="0"/>
         </w:rPr>
-        <w:t>安全模块的鉴权工作主要由Sa-Token完成。用户登录时，前端将账号密码POST至/api/user/login，后端首先进行非空校验，随后调用userService.userLogin()对输入密码执行加盐MD5处理，并与数据库中的密文进行比对；比对通过后调用StpUtil.login(userId)创建会话，会话信息结合Redis进行存储，并在返回前端时一并携带用户信息与角色标识，以支持前端完成权限展示控制。登录核心代码如下。</w:t>
-      </w:r>
-    </w:p>
-    <w:p>
-      <w:pPr>
-        <w:spacing w:before="0" w:after="0" w:line="300" w:lineRule="exact"/>
-        <w:ind w:left="567"/>
-      </w:pPr>
-      <w:r>
-        <w:rPr>
-          <w:rFonts w:ascii="Courier New" w:hAnsi="Courier New" w:eastAsia="仿宋"/>
-          <w:sz w:val="18"/>
-        </w:rPr>
-        <w:t>@PostMapping("/login")</w:t>
-      </w:r>
-    </w:p>
-    <w:p>
-      <w:pPr>
-        <w:spacing w:before="0" w:after="0" w:line="300" w:lineRule="exact"/>
-        <w:ind w:left="567"/>
-      </w:pPr>
-      <w:r>
-        <w:rPr>
-          <w:rFonts w:ascii="Courier New" w:hAnsi="Courier New" w:eastAsia="仿宋"/>
-          <w:sz w:val="18"/>
-        </w:rPr>
-        <w:t>public BaseResponse&lt;Map&lt;String,Object&gt;&gt; userLogin(</w:t>
-      </w:r>
-    </w:p>
-    <w:p>
-      <w:pPr>
-        <w:spacing w:before="0" w:after="0" w:line="300" w:lineRule="exact"/>
-        <w:ind w:left="567"/>
-      </w:pPr>
-      <w:r>
-        <w:rPr>
-          <w:rFonts w:ascii="Courier New" w:hAnsi="Courier New" w:eastAsia="仿宋"/>
-          <w:sz w:val="18"/>
-        </w:rPr>
-        <w:t xml:space="preserve">        @RequestBody UserLoginRequest req, HttpServletRequest request) {</w:t>
-      </w:r>
-    </w:p>
-    <w:p>
-      <w:pPr>
-        <w:spacing w:before="0" w:after="0" w:line="300" w:lineRule="exact"/>
-        <w:ind w:left="567"/>
-      </w:pPr>
-      <w:r>
-        <w:rPr>
-          <w:rFonts w:ascii="Courier New" w:hAnsi="Courier New" w:eastAsia="仿宋"/>
-          <w:sz w:val="18"/>
-        </w:rPr>
-        <w:t xml:space="preserve">    if (req == null)</w:t>
-      </w:r>
-    </w:p>
-    <w:p>
-      <w:pPr>
-        <w:spacing w:before="0" w:after="0" w:line="300" w:lineRule="exact"/>
-        <w:ind w:left="567"/>
-      </w:pPr>
-      <w:r>
-        <w:rPr>
-          <w:rFonts w:ascii="Courier New" w:hAnsi="Courier New" w:eastAsia="仿宋"/>
-          <w:sz w:val="18"/>
-        </w:rPr>
-        <w:t xml:space="preserve">        throw new BusinessException(ErrorCode.PARAMS_ERROR);</w:t>
-      </w:r>
-    </w:p>
-    <w:p>
-      <w:pPr>
-        <w:spacing w:before="0" w:after="0" w:line="300" w:lineRule="exact"/>
-        <w:ind w:left="567"/>
-      </w:pPr>
-      <w:r>
-        <w:rPr>
-          <w:rFonts w:ascii="Courier New" w:hAnsi="Courier New" w:eastAsia="仿宋"/>
-          <w:sz w:val="18"/>
-        </w:rPr>
-        <w:t xml:space="preserve">    String account  = req.getUserAccount();</w:t>
-      </w:r>
-    </w:p>
-    <w:p>
-      <w:pPr>
-        <w:spacing w:before="0" w:after="0" w:line="300" w:lineRule="exact"/>
-        <w:ind w:left="567"/>
-      </w:pPr>
-      <w:r>
-        <w:rPr>
-          <w:rFonts w:ascii="Courier New" w:hAnsi="Courier New" w:eastAsia="仿宋"/>
-          <w:sz w:val="18"/>
-        </w:rPr>
-        <w:t xml:space="preserve">    String password = req.getUserPassword();</w:t>
-      </w:r>
-    </w:p>
-    <w:p>
-      <w:pPr>
-        <w:spacing w:before="0" w:after="0" w:line="300" w:lineRule="exact"/>
-        <w:ind w:left="567"/>
-      </w:pPr>
-      <w:r>
-        <w:rPr>
-          <w:rFonts w:ascii="Courier New" w:hAnsi="Courier New" w:eastAsia="仿宋"/>
-          <w:sz w:val="18"/>
-        </w:rPr>
-        <w:t xml:space="preserve">    if (StringUtils.isAnyBlank(account, password))</w:t>
-      </w:r>
-    </w:p>
-    <w:p>
-      <w:pPr>
-        <w:spacing w:before="0" w:after="0" w:line="300" w:lineRule="exact"/>
-        <w:ind w:left="567"/>
-      </w:pPr>
-      <w:r>
-        <w:rPr>
-          <w:rFonts w:ascii="Courier New" w:hAnsi="Courier New" w:eastAsia="仿宋"/>
-          <w:sz w:val="18"/>
-        </w:rPr>
-        <w:t xml:space="preserve">        throw new BusinessException(ErrorCode.PARAMS_ERROR);</w:t>
-      </w:r>
-    </w:p>
-    <w:p>
-      <w:pPr>
-        <w:spacing w:before="0" w:after="0" w:line="300" w:lineRule="exact"/>
-        <w:ind w:left="567"/>
-      </w:pPr>
-      <w:r>
-        <w:rPr>
-          <w:rFonts w:ascii="Courier New" w:hAnsi="Courier New" w:eastAsia="仿宋"/>
-          <w:sz w:val="18"/>
-        </w:rPr>
-        <w:t xml:space="preserve">    User user = userService.userLogin(account, password, request);</w:t>
-      </w:r>
-    </w:p>
-    <w:p>
-      <w:pPr>
-        <w:spacing w:before="0" w:after="0" w:line="300" w:lineRule="exact"/>
-        <w:ind w:left="567"/>
-      </w:pPr>
-      <w:r>
-        <w:rPr>
-          <w:rFonts w:ascii="Courier New" w:hAnsi="Courier New" w:eastAsia="仿宋"/>
-          <w:sz w:val="18"/>
-        </w:rPr>
-        <w:t xml:space="preserve">    LoginUserVO loginUserVO = userService.getLoginUserVO(user);</w:t>
-      </w:r>
-    </w:p>
-    <w:p>
-      <w:pPr>
-        <w:spacing w:before="0" w:after="0" w:line="300" w:lineRule="exact"/>
-        <w:ind w:left="567"/>
-      </w:pPr>
-      <w:r>
-        <w:rPr>
-          <w:rFonts w:ascii="Courier New" w:hAnsi="Courier New" w:eastAsia="仿宋"/>
-          <w:sz w:val="18"/>
-        </w:rPr>
-        <w:t xml:space="preserve">    SaTokenInfo tokenInfo  = StpUtil.getTokenInfo();</w:t>
-      </w:r>
-    </w:p>
-    <w:p>
-      <w:pPr>
-        <w:spacing w:before="0" w:after="0" w:line="300" w:lineRule="exact"/>
-        <w:ind w:left="567"/>
-      </w:pPr>
-      <w:r>
-        <w:rPr>
-          <w:rFonts w:ascii="Courier New" w:hAnsi="Courier New" w:eastAsia="仿宋"/>
-          <w:sz w:val="18"/>
-        </w:rPr>
-        <w:t xml:space="preserve">    Map&lt;String,Object&gt; result = new HashMap&lt;&gt;();</w:t>
-      </w:r>
-    </w:p>
-    <w:p>
-      <w:pPr>
-        <w:spacing w:before="0" w:after="0" w:line="300" w:lineRule="exact"/>
-        <w:ind w:left="567"/>
-      </w:pPr>
-      <w:r>
-        <w:rPr>
-          <w:rFonts w:ascii="Courier New" w:hAnsi="Courier New" w:eastAsia="仿宋"/>
-          <w:sz w:val="18"/>
-        </w:rPr>
-        <w:t xml:space="preserve">    result.put("user",       loginUserVO);</w:t>
-      </w:r>
-    </w:p>
-    <w:p>
-      <w:pPr>
-        <w:spacing w:before="0" w:after="0" w:line="300" w:lineRule="exact"/>
-        <w:ind w:left="567"/>
-      </w:pPr>
-      <w:r>
-        <w:rPr>
-          <w:rFonts w:ascii="Courier New" w:hAnsi="Courier New" w:eastAsia="仿宋"/>
-          <w:sz w:val="18"/>
-        </w:rPr>
-        <w:t xml:space="preserve">    result.put("tokenName",  tokenInfo.getTokenName());</w:t>
-      </w:r>
-    </w:p>
-    <w:p>
-      <w:pPr>
-        <w:spacing w:before="0" w:after="0" w:line="300" w:lineRule="exact"/>
-        <w:ind w:left="567"/>
-      </w:pPr>
-      <w:r>
-        <w:rPr>
-          <w:rFonts w:ascii="Courier New" w:hAnsi="Courier New" w:eastAsia="仿宋"/>
-          <w:sz w:val="18"/>
-        </w:rPr>
-        <w:t xml:space="preserve">    result.put("tokenValue", tokenInfo.getTokenValue());</w:t>
-      </w:r>
-    </w:p>
-    <w:p>
-      <w:pPr>
-        <w:spacing w:before="0" w:after="0" w:line="300" w:lineRule="exact"/>
-        <w:ind w:left="567"/>
-      </w:pPr>
-      <w:r>
-        <w:rPr>
-          <w:rFonts w:ascii="Courier New" w:hAnsi="Courier New" w:eastAsia="仿宋"/>
-          <w:sz w:val="18"/>
-        </w:rPr>
-        <w:t xml:space="preserve">    result.put("role",       user.getUserRole());</w:t>
-      </w:r>
-    </w:p>
-    <w:p>
-      <w:pPr>
-        <w:spacing w:before="0" w:after="0" w:line="300" w:lineRule="exact"/>
-        <w:ind w:left="567"/>
-      </w:pPr>
-      <w:r>
-        <w:rPr>
-          <w:rFonts w:ascii="Courier New" w:hAnsi="Courier New" w:eastAsia="仿宋"/>
-          <w:sz w:val="18"/>
-        </w:rPr>
-        <w:t xml:space="preserve">    return ResultUtils.success(result);</w:t>
-      </w:r>
-    </w:p>
-    <w:p>
-      <w:pPr>
-        <w:spacing w:before="0" w:after="0" w:line="300" w:lineRule="exact"/>
-        <w:ind w:left="567"/>
-      </w:pPr>
-      <w:r>
-        <w:rPr>
-          <w:rFonts w:ascii="Courier New" w:hAnsi="Courier New" w:eastAsia="仿宋"/>
-          <w:sz w:val="18"/>
-        </w:rPr>
-        <w:t>}</w:t>
-      </w:r>
-    </w:p>
-    <w:p>
-      <w:pPr>
-        <w:spacing w:after="120"/>
-      </w:pPr>
+        <w:t>安全模块的鉴权工作主要由Sa-Token完成。用户登录时，前端将账号密码POST至/api/user/login，后端首先进行非空校验，随后调用userService.userLogin()对输入密码执行加盐MD5处理，并与数据库中的密文进行比对；比对通过后调用StpUtil.login(userId)创建会话，会话信息结合Redis进行存储，并在返回前端时一并携带用户信息与角色标识，以支持前端完成权限展示控制。登录接口的处理流程可以概括为：接收并校验登录请求参数、调用用户服务完成账号密码校验、生成Sa-Token会话、封装用户信息与Token信息后统一返回。</w:t>
+      </w:r>
     </w:p>
     <w:p>
       <w:pPr>
@@ -13912,351 +12597,8 @@
           <w:sz w:val="24"/>
           <w:bCs w:val="0"/>
         </w:rPr>
-        <w:t>Spring Cloud Gateway通过自定义SaReactorFilter拦截所有入站请求，对登录、注册以及当前预留的验证码路径直接放行，其余接口调用StpUtil.checkLogin()进行Token有效性验证。Sa-Token从HTTP请求头中提取Token值，到Redis中查询对应会话信息，若Token不存在或已过期则返回错误信息。鉴权过滤器同时处理CORS预检请求（OPTIONS方法），通过setHeader注入跨域响应头后直接放行，避免浏览器跨域限制影响前端正常请求。</w:t>
-      </w:r>
-    </w:p>
-    <w:p>
-      <w:pPr>
-        <w:spacing w:before="0" w:after="0" w:line="300" w:lineRule="exact"/>
-        <w:ind w:left="567"/>
-      </w:pPr>
-      <w:r>
-        <w:rPr>
-          <w:rFonts w:ascii="Courier New" w:hAnsi="Courier New" w:eastAsia="仿宋"/>
-          <w:sz w:val="18"/>
-        </w:rPr>
-        <w:t>@Bean</w:t>
-      </w:r>
-    </w:p>
-    <w:p>
-      <w:pPr>
-        <w:spacing w:before="0" w:after="0" w:line="300" w:lineRule="exact"/>
-        <w:ind w:left="567"/>
-      </w:pPr>
-      <w:r>
-        <w:rPr>
-          <w:rFonts w:ascii="Courier New" w:hAnsi="Courier New" w:eastAsia="仿宋"/>
-          <w:sz w:val="18"/>
-        </w:rPr>
-        <w:t>public SaReactorFilter saReactorFilter() {</w:t>
-      </w:r>
-    </w:p>
-    <w:p>
-      <w:pPr>
-        <w:spacing w:before="0" w:after="0" w:line="300" w:lineRule="exact"/>
-        <w:ind w:left="567"/>
-      </w:pPr>
-      <w:r>
-        <w:rPr>
-          <w:rFonts w:ascii="Courier New" w:hAnsi="Courier New" w:eastAsia="仿宋"/>
-          <w:sz w:val="18"/>
-        </w:rPr>
-        <w:t xml:space="preserve">    return new SaReactorFilter()</w:t>
-      </w:r>
-    </w:p>
-    <w:p>
-      <w:pPr>
-        <w:spacing w:before="0" w:after="0" w:line="300" w:lineRule="exact"/>
-        <w:ind w:left="567"/>
-      </w:pPr>
-      <w:r>
-        <w:rPr>
-          <w:rFonts w:ascii="Courier New" w:hAnsi="Courier New" w:eastAsia="仿宋"/>
-          <w:sz w:val="18"/>
-        </w:rPr>
-        <w:t xml:space="preserve">        .addInclude("/**")</w:t>
-      </w:r>
-    </w:p>
-    <w:p>
-      <w:pPr>
-        <w:spacing w:before="0" w:after="0" w:line="300" w:lineRule="exact"/>
-        <w:ind w:left="567"/>
-      </w:pPr>
-      <w:r>
-        <w:rPr>
-          <w:rFonts w:ascii="Courier New" w:hAnsi="Courier New" w:eastAsia="仿宋"/>
-          <w:sz w:val="18"/>
-        </w:rPr>
-        <w:t xml:space="preserve">        .addExclude(</w:t>
-      </w:r>
-    </w:p>
-    <w:p>
-      <w:pPr>
-        <w:spacing w:before="0" w:after="0" w:line="300" w:lineRule="exact"/>
-        <w:ind w:left="567"/>
-      </w:pPr>
-      <w:r>
-        <w:rPr>
-          <w:rFonts w:ascii="Courier New" w:hAnsi="Courier New" w:eastAsia="仿宋"/>
-          <w:sz w:val="18"/>
-        </w:rPr>
-        <w:t xml:space="preserve">            "/favicon.ico",</w:t>
-      </w:r>
-    </w:p>
-    <w:p>
-      <w:pPr>
-        <w:spacing w:before="0" w:after="0" w:line="300" w:lineRule="exact"/>
-        <w:ind w:left="567"/>
-      </w:pPr>
-      <w:r>
-        <w:rPr>
-          <w:rFonts w:ascii="Courier New" w:hAnsi="Courier New" w:eastAsia="仿宋"/>
-          <w:sz w:val="18"/>
-        </w:rPr>
-        <w:t xml:space="preserve">            "/api/user/login",</w:t>
-      </w:r>
-    </w:p>
-    <w:p>
-      <w:pPr>
-        <w:spacing w:before="0" w:after="0" w:line="300" w:lineRule="exact"/>
-        <w:ind w:left="567"/>
-      </w:pPr>
-      <w:r>
-        <w:rPr>
-          <w:rFonts w:ascii="Courier New" w:hAnsi="Courier New" w:eastAsia="仿宋"/>
-          <w:sz w:val="18"/>
-        </w:rPr>
-        <w:t xml:space="preserve">            "/api/user/register",</w:t>
-      </w:r>
-    </w:p>
-    <w:p>
-      <w:pPr>
-        <w:spacing w:before="0" w:after="0" w:line="300" w:lineRule="exact"/>
-        <w:ind w:left="567"/>
-      </w:pPr>
-      <w:r>
-        <w:rPr>
-          <w:rFonts w:ascii="Courier New" w:hAnsi="Courier New" w:eastAsia="仿宋"/>
-          <w:sz w:val="18"/>
-        </w:rPr>
-        <w:t xml:space="preserve">            "/api/user/captcha"</w:t>
-      </w:r>
-    </w:p>
-    <w:p>
-      <w:pPr>
-        <w:spacing w:before="0" w:after="0" w:line="300" w:lineRule="exact"/>
-        <w:ind w:left="567"/>
-      </w:pPr>
-      <w:r>
-        <w:rPr>
-          <w:rFonts w:ascii="Courier New" w:hAnsi="Courier New" w:eastAsia="仿宋"/>
-          <w:sz w:val="18"/>
-        </w:rPr>
-        <w:t xml:space="preserve">        )</w:t>
-      </w:r>
-    </w:p>
-    <w:p>
-      <w:pPr>
-        <w:spacing w:before="0" w:after="0" w:line="300" w:lineRule="exact"/>
-        <w:ind w:left="567"/>
-      </w:pPr>
-      <w:r>
-        <w:rPr>
-          <w:rFonts w:ascii="Courier New" w:hAnsi="Courier New" w:eastAsia="仿宋"/>
-          <w:sz w:val="18"/>
-        </w:rPr>
-        <w:t xml:space="preserve">        .setAuth(obj -&gt; {</w:t>
-      </w:r>
-    </w:p>
-    <w:p>
-      <w:pPr>
-        <w:spacing w:before="0" w:after="0" w:line="300" w:lineRule="exact"/>
-        <w:ind w:left="567"/>
-      </w:pPr>
-      <w:r>
-        <w:rPr>
-          <w:rFonts w:ascii="Courier New" w:hAnsi="Courier New" w:eastAsia="仿宋"/>
-          <w:sz w:val="18"/>
-        </w:rPr>
-        <w:t xml:space="preserve">            SaRouter.match("/**", StpUtil::checkLogin);</w:t>
-      </w:r>
-    </w:p>
-    <w:p>
-      <w:pPr>
-        <w:spacing w:before="0" w:after="0" w:line="300" w:lineRule="exact"/>
-        <w:ind w:left="567"/>
-      </w:pPr>
-      <w:r>
-        <w:rPr>
-          <w:rFonts w:ascii="Courier New" w:hAnsi="Courier New" w:eastAsia="仿宋"/>
-          <w:sz w:val="18"/>
-        </w:rPr>
-        <w:t xml:space="preserve">        })</w:t>
-      </w:r>
-    </w:p>
-    <w:p>
-      <w:pPr>
-        <w:spacing w:before="0" w:after="0" w:line="300" w:lineRule="exact"/>
-        <w:ind w:left="567"/>
-      </w:pPr>
-      <w:r>
-        <w:rPr>
-          <w:rFonts w:ascii="Courier New" w:hAnsi="Courier New" w:eastAsia="仿宋"/>
-          <w:sz w:val="18"/>
-        </w:rPr>
-        <w:t xml:space="preserve">        .setBeforeAuth(obj -&gt; {</w:t>
-      </w:r>
-    </w:p>
-    <w:p>
-      <w:pPr>
-        <w:spacing w:before="0" w:after="0" w:line="300" w:lineRule="exact"/>
-        <w:ind w:left="567"/>
-      </w:pPr>
-      <w:r>
-        <w:rPr>
-          <w:rFonts w:ascii="Courier New" w:hAnsi="Courier New" w:eastAsia="仿宋"/>
-          <w:sz w:val="18"/>
-        </w:rPr>
-        <w:t xml:space="preserve">            SaHolder.getResponse()</w:t>
-      </w:r>
-    </w:p>
-    <w:p>
-      <w:pPr>
-        <w:spacing w:before="0" w:after="0" w:line="300" w:lineRule="exact"/>
-        <w:ind w:left="567"/>
-      </w:pPr>
-      <w:r>
-        <w:rPr>
-          <w:rFonts w:ascii="Courier New" w:hAnsi="Courier New" w:eastAsia="仿宋"/>
-          <w:sz w:val="18"/>
-        </w:rPr>
-        <w:t xml:space="preserve">                .setHeader("Access-Control-Allow-Origin",</w:t>
-      </w:r>
-    </w:p>
-    <w:p>
-      <w:pPr>
-        <w:spacing w:before="0" w:after="0" w:line="300" w:lineRule="exact"/>
-        <w:ind w:left="567"/>
-      </w:pPr>
-      <w:r>
-        <w:rPr>
-          <w:rFonts w:ascii="Courier New" w:hAnsi="Courier New" w:eastAsia="仿宋"/>
-          <w:sz w:val="18"/>
-        </w:rPr>
-        <w:t xml:space="preserve">                    "http://localhost:8000")</w:t>
-      </w:r>
-    </w:p>
-    <w:p>
-      <w:pPr>
-        <w:spacing w:before="0" w:after="0" w:line="300" w:lineRule="exact"/>
-        <w:ind w:left="567"/>
-      </w:pPr>
-      <w:r>
-        <w:rPr>
-          <w:rFonts w:ascii="Courier New" w:hAnsi="Courier New" w:eastAsia="仿宋"/>
-          <w:sz w:val="18"/>
-        </w:rPr>
-        <w:t xml:space="preserve">                .setHeader("Access-Control-Allow-Methods","*")</w:t>
-      </w:r>
-    </w:p>
-    <w:p>
-      <w:pPr>
-        <w:spacing w:before="0" w:after="0" w:line="300" w:lineRule="exact"/>
-        <w:ind w:left="567"/>
-      </w:pPr>
-      <w:r>
-        <w:rPr>
-          <w:rFonts w:ascii="Courier New" w:hAnsi="Courier New" w:eastAsia="仿宋"/>
-          <w:sz w:val="18"/>
-        </w:rPr>
-        <w:t xml:space="preserve">                .setHeader("Access-Control-Allow-Headers",</w:t>
-      </w:r>
-    </w:p>
-    <w:p>
-      <w:pPr>
-        <w:spacing w:before="0" w:after="0" w:line="300" w:lineRule="exact"/>
-        <w:ind w:left="567"/>
-      </w:pPr>
-      <w:r>
-        <w:rPr>
-          <w:rFonts w:ascii="Courier New" w:hAnsi="Courier New" w:eastAsia="仿宋"/>
-          <w:sz w:val="18"/>
-        </w:rPr>
-        <w:t xml:space="preserve">                    "authorization, content-type")</w:t>
-      </w:r>
-    </w:p>
-    <w:p>
-      <w:pPr>
-        <w:spacing w:before="0" w:after="0" w:line="300" w:lineRule="exact"/>
-        <w:ind w:left="567"/>
-      </w:pPr>
-      <w:r>
-        <w:rPr>
-          <w:rFonts w:ascii="Courier New" w:hAnsi="Courier New" w:eastAsia="仿宋"/>
-          <w:sz w:val="18"/>
-        </w:rPr>
-        <w:t xml:space="preserve">                .setHeader("Access-Control-Allow-Credentials",</w:t>
-      </w:r>
-    </w:p>
-    <w:p>
-      <w:pPr>
-        <w:spacing w:before="0" w:after="0" w:line="300" w:lineRule="exact"/>
-        <w:ind w:left="567"/>
-      </w:pPr>
-      <w:r>
-        <w:rPr>
-          <w:rFonts w:ascii="Courier New" w:hAnsi="Courier New" w:eastAsia="仿宋"/>
-          <w:sz w:val="18"/>
-        </w:rPr>
-        <w:t xml:space="preserve">                    "true")</w:t>
-      </w:r>
-    </w:p>
-    <w:p>
-      <w:pPr>
-        <w:spacing w:before="0" w:after="0" w:line="300" w:lineRule="exact"/>
-        <w:ind w:left="567"/>
-      </w:pPr>
-      <w:r>
-        <w:rPr>
-          <w:rFonts w:ascii="Courier New" w:hAnsi="Courier New" w:eastAsia="仿宋"/>
-          <w:sz w:val="18"/>
-        </w:rPr>
-        <w:t xml:space="preserve">                .setHeader("Access-Control-Max-Age","3600");</w:t>
-      </w:r>
-    </w:p>
-    <w:p>
-      <w:pPr>
-        <w:spacing w:before="0" w:after="0" w:line="300" w:lineRule="exact"/>
-        <w:ind w:left="567"/>
-      </w:pPr>
-      <w:r>
-        <w:rPr>
-          <w:rFonts w:ascii="Courier New" w:hAnsi="Courier New" w:eastAsia="仿宋"/>
-          <w:sz w:val="18"/>
-        </w:rPr>
-        <w:t xml:space="preserve">            SaRouter.match(SaHttpMethod.OPTIONS).free(r-&gt;{}).back();</w:t>
-      </w:r>
-    </w:p>
-    <w:p>
-      <w:pPr>
-        <w:spacing w:before="0" w:after="0" w:line="300" w:lineRule="exact"/>
-        <w:ind w:left="567"/>
-      </w:pPr>
-      <w:r>
-        <w:rPr>
-          <w:rFonts w:ascii="Courier New" w:hAnsi="Courier New" w:eastAsia="仿宋"/>
-          <w:sz w:val="18"/>
-        </w:rPr>
-        <w:t xml:space="preserve">        });</w:t>
-      </w:r>
-    </w:p>
-    <w:p>
-      <w:pPr>
-        <w:spacing w:before="0" w:after="0" w:line="300" w:lineRule="exact"/>
-        <w:ind w:left="567"/>
-      </w:pPr>
-      <w:r>
-        <w:rPr>
-          <w:rFonts w:ascii="Courier New" w:hAnsi="Courier New" w:eastAsia="仿宋"/>
-          <w:sz w:val="18"/>
-        </w:rPr>
-        <w:t>}</w:t>
-      </w:r>
-    </w:p>
-    <w:p>
-      <w:pPr>
-        <w:spacing w:after="120"/>
-      </w:pPr>
+        <w:t>Spring Cloud Gateway通过自定义鉴权过滤器拦截所有入站请求，对登录、注册以及当前预留的验证码路径直接放行，其余接口统一执行Token有效性验证。Sa-Token从HTTP请求头中提取Token值，到Redis中查询对应会话信息，若Token不存在或已过期则返回错误信息。鉴权过滤器同时处理CORS预检请求（OPTIONS方法），通过补充跨域响应头后直接放行，避免浏览器跨域限制影响前端正常请求。其过滤规则主要包括三部分：其一，对全部业务路径进行统一接入控制，并排除favicon、登录、注册和验证码等白名单接口；其二，在鉴权阶段统一执行登录态校验；其三，在前置处理阶段补充跨域相关响应头，并对OPTIONS预检请求直接放行。</w:t>
+      </w:r>
     </w:p>
     <w:p>
       <w:pPr>
@@ -14362,7 +12704,7 @@
           <w:sz w:val="24"/>
           <w:bCs w:val="0"/>
         </w:rPr>
-        <w:t>本章以六大功能模块为核心，通过关键代码解析与系统界面截图相结合的方式，系统性呈现了智能推荐、高并发选课防护、时间冲突检测、系统管理、消息通知和安全鉴权模块的实现细节。智能推荐模块通过专业匹配评分实现了轻量级的个性化推荐；高并发选课模块通过Redisson锁、处理日志与RabbitMQ队列协同控制并发压力；冲突检测模块基于时间窗口扩展算法对主要重叠场景进行预警；安全模块实现了统一登录态校验与会话管理。各模块协同工作共同支撑了系统在高并发、高可靠场景下的运行。</w:t>
+        <w:t>本章以六大功能模块为核心，通过实现逻辑说明与系统界面截图相结合的方式，系统性呈现了智能推荐、高并发选课防护、时间冲突检测、系统管理、消息通知和安全鉴权模块的实现细节。智能推荐模块通过专业匹配评分实现了轻量级的个性化推荐；高并发选课模块通过Redisson锁、处理日志与RabbitMQ队列协同控制并发压力；冲突检测模块基于时间窗口扩展算法对主要重叠场景进行预警；安全模块实现了统一登录态校验与会话管理。各模块协同工作共同支撑了系统在高并发、高可靠场景下的运行。</w:t>
       </w:r>
     </w:p>
     <w:p>

</xml_diff>

<commit_message>
docs(thesis): strengthen tool usage and testing evidence
</commit_message>
<xml_diff>
--- a/6020222035-彭益举/2425_41_10475_080902_6020222035_LW.docx
+++ b/6020222035-彭益举/2425_41_10475_080902_6020222035_LW.docx
@@ -1758,7 +1758,7 @@
         </w:rPr>
         <w:t>3.2 功能需求分析</w:t>
         <w:tab/>
-        <w:t>8</w:t>
+        <w:t>9</w:t>
       </w:r>
     </w:p>
     <w:p>
@@ -1778,7 +1778,7 @@
         </w:rPr>
         <w:t>3.2.1 功能描述</w:t>
         <w:tab/>
-        <w:t>8</w:t>
+        <w:t>9</w:t>
       </w:r>
     </w:p>
     <w:p>
@@ -2658,7 +2658,7 @@
         </w:rPr>
         <w:t>6.2.2 智能推荐功能测试</w:t>
         <w:tab/>
-        <w:t>29</w:t>
+        <w:t>30</w:t>
       </w:r>
     </w:p>
     <w:p>
@@ -2698,7 +2698,7 @@
         </w:rPr>
         <w:t>6.2.4 冲突检测功能测试</w:t>
         <w:tab/>
-        <w:t>30</w:t>
+        <w:t>31</w:t>
       </w:r>
     </w:p>
     <w:p>
@@ -2738,7 +2738,7 @@
         </w:rPr>
         <w:t>6.2.6 消息通知模块功能测试</w:t>
         <w:tab/>
-        <w:t>31</w:t>
+        <w:t>32</w:t>
       </w:r>
     </w:p>
     <w:p>
@@ -2758,7 +2758,7 @@
         </w:rPr>
         <w:t>6.3 性能压力测试</w:t>
         <w:tab/>
-        <w:t>31</w:t>
+        <w:t>32</w:t>
       </w:r>
     </w:p>
     <w:p>
@@ -2778,7 +2778,7 @@
         </w:rPr>
         <w:t>6.4 本章小结</w:t>
         <w:tab/>
-        <w:t>32</w:t>
+        <w:t>33</w:t>
       </w:r>
     </w:p>
     <w:p>
@@ -3949,7 +3949,7 @@
           <w:sz w:val="24"/>
           <w:bCs w:val="0"/>
         </w:rPr>
-        <w:t>集成开发环境：后端开发采用IntelliJ IDEA 2023 Ultimate版，通过深度集成的Spring Boot插件、Nacos工具、Docker支持，实现从微服务编码到容器化构建的全流程开发。前端开发采用VS Code，配合ESLint、TypeScript语言服务和Ant Design Pro代码片段，提升界面开发效率与代码质量。版本管理采用Git，通过Gitee托管代码仓库，执行特性分支开发模式，commit message遵循约定式规范。数据库管理：Navicat Premium 15用于MySQL管理；Another Redis Desktop Manager用于Redis监控；Postman用于API接口调试。</w:t>
+        <w:t>集成开发环境：后端开发采用IntelliJ IDEA 2023 Ultimate版，通过深度集成的Spring Boot插件、Nacos工具、Docker支持，实现从微服务编码到容器化构建的全流程开发。前端开发采用VS Code，配合ESLint、TypeScript语言服务和Ant Design Pro代码片段，提升界面开发效率与代码质量。版本管理采用Git，通过Gitee托管代码仓库，执行特性分支开发模式，commit message遵循约定式规范。数据库管理方面，Navicat Premium 15用于MySQL管理，Another Redis Desktop Manager用于Redis监控。接口联调与功能测试阶段使用Postman对登录、推荐、选课、退课、消息查询等核心接口逐项发送请求并核对响应结果，为第六章测试过程整理提供原始记录。</w:t>
       </w:r>
     </w:p>
     <w:p>
@@ -4176,6 +4176,23 @@
           <w:bCs w:val="0"/>
         </w:rPr>
         <w:t>本系统由笔者独立开发完成，所采用技术栈均为开源方案，软件授权成本较低。开发工具方面，后端使用学校提供教育授权的IntelliJ IDEA，前端使用VS Code。部署资源方面，系统运行于一台2核4G基础云服务器，中间件通过Docker Compose统一编排。综合服务器、域名及其他支出，全年总成本控制在300元以内，符合毕业设计项目对开发成本的预期要求。</w:t>
+      </w:r>
+    </w:p>
+    <w:p>
+      <w:pPr>
+        <w:pStyle w:val="ThesisBody"/>
+        <w:spacing w:before="0" w:after="0" w:line="400" w:lineRule="exact"/>
+        <w:ind w:firstLine="480"/>
+        <w:jc w:val="both"/>
+      </w:pPr>
+      <w:r>
+        <w:rPr>
+          <w:rFonts w:ascii="Times New Roman" w:hAnsi="Times New Roman" w:eastAsia="宋体"/>
+          <w:b w:val="0"/>
+          <w:sz w:val="24"/>
+          <w:bCs w:val="0"/>
+        </w:rPr>
+        <w:t>从工作量构成看，项目不仅完成了需求分析、数据库设计、微服务拆分、前后端编码与接口联调，还覆盖了容器化部署、功能测试、性能测试、截图取证、论文撰写与反复修改等完整工程链路，整体工作量能够满足软件工程专业本科毕业设计的基本要求。</w:t>
       </w:r>
     </w:p>
     <w:p>
@@ -12760,7 +12777,7 @@
           <w:sz w:val="24"/>
           <w:bCs w:val="0"/>
         </w:rPr>
-        <w:t>系统测试是验证软件功能正确性与非功能性指标合规性的关键环节。本文采用多层次测试策略：通过手动黑盒功能测试验证各模块业务逻辑的正确性；通过JMeter性能压力测试评估系统在高并发场景下的响应能力与稳定性，为优化提供量化数据[11]。测试覆盖系统安全（登录鉴权）、智能推荐、选课流程、冲突检测、系统管理、消息通知六大功能模块，以及高并发选课场景下的性能指标验证。</w:t>
+        <w:t>系统测试是验证软件功能正确性与非功能性指标合规性的关键环节。本文采用多层次测试策略：功能测试阶段使用Postman对登录、注册、推荐查询、选课提交、退课、消息查询等核心接口逐项构造请求，结合系统页面操作结果进行黑盒验证，并通过表格和界面截图记录测试过程与结果；性能测试阶段使用JMeter对选课接口开展并发压力测试，统计平均响应时间、吞吐量、错误率等量化指标[11]。测试覆盖系统安全（登录鉴权）、智能推荐、选课流程、冲突检测、系统管理、消息通知六大功能模块，以及高并发选课场景下的性能指标验证。</w:t>
       </w:r>
     </w:p>
     <w:p>
@@ -12811,7 +12828,80 @@
           <w:sz w:val="24"/>
           <w:bCs w:val="0"/>
         </w:rPr>
-        <w:t>系统安全功能测试重点验证用户认证机制、登录态校验与受保护接口访问控制的有效性，测试用例如表6.1所示。</w:t>
+        <w:t>系统安全功能测试重点验证用户认证机制、登录态校验与受保护接口访问控制的有效性。测试时先使用Postman对登录、注册和受保护接口进行请求验证，再结合前端页面跳转与提示信息核对最终结果，测试用例如表6.1所示。</w:t>
+      </w:r>
+    </w:p>
+    <w:p>
+      <w:pPr>
+        <w:spacing w:before="120" w:after="0"/>
+        <w:jc w:val="center"/>
+      </w:pPr>
+      <w:r>
+        <w:drawing>
+          <wp:inline xmlns:a="http://schemas.openxmlformats.org/drawingml/2006/main" xmlns:pic="http://schemas.openxmlformats.org/drawingml/2006/picture">
+            <wp:extent cx="5040000" cy="3060000"/>
+            <wp:docPr id="27" name="Picture 27"/>
+            <wp:cNvGraphicFramePr>
+              <a:graphicFrameLocks noChangeAspect="1"/>
+            </wp:cNvGraphicFramePr>
+            <a:graphic>
+              <a:graphicData uri="http://schemas.openxmlformats.org/drawingml/2006/picture">
+                <pic:pic>
+                  <pic:nvPicPr>
+                    <pic:cNvPr id="0" name="fig_postman_login_test.png"/>
+                    <pic:cNvPicPr/>
+                  </pic:nvPicPr>
+                  <pic:blipFill>
+                    <a:blip r:embed="rId45"/>
+                    <a:stretch>
+                      <a:fillRect/>
+                    </a:stretch>
+                  </pic:blipFill>
+                  <pic:spPr>
+                    <a:xfrm>
+                      <a:off x="0" y="0"/>
+                      <a:ext cx="5040000" cy="3060000"/>
+                    </a:xfrm>
+                    <a:prstGeom prst="rect"/>
+                  </pic:spPr>
+                </pic:pic>
+              </a:graphicData>
+            </a:graphic>
+          </wp:inline>
+        </w:drawing>
+      </w:r>
+    </w:p>
+    <w:p>
+      <w:pPr>
+        <w:pStyle w:val="ThesisCaption"/>
+        <w:spacing w:before="60" w:after="120" w:line="400" w:lineRule="exact"/>
+        <w:jc w:val="center"/>
+      </w:pPr>
+      <w:r>
+        <w:rPr>
+          <w:rFonts w:ascii="Times New Roman" w:hAnsi="Times New Roman" w:eastAsia="宋体"/>
+          <w:b w:val="0"/>
+          <w:sz w:val="21"/>
+          <w:bCs w:val="0"/>
+        </w:rPr>
+        <w:t>图 6.1  Postman 登录接口测试结果图</w:t>
+      </w:r>
+    </w:p>
+    <w:p>
+      <w:pPr>
+        <w:pStyle w:val="ThesisBody"/>
+        <w:spacing w:before="0" w:after="0" w:line="400" w:lineRule="exact"/>
+        <w:ind w:firstLine="480"/>
+        <w:jc w:val="both"/>
+      </w:pPr>
+      <w:r>
+        <w:rPr>
+          <w:rFonts w:ascii="Times New Roman" w:hAnsi="Times New Roman" w:eastAsia="宋体"/>
+          <w:b w:val="0"/>
+          <w:sz w:val="24"/>
+          <w:bCs w:val="0"/>
+        </w:rPr>
+        <w:t>以登录接口为例，测试过程需要同时记录请求地址、请求体、响应状态码和关键返回字段，接口测试结果如图6.1所示。该图可直观反映接口测试并非停留在页面点击层面，而是通过专业工具对输入输出进行逐项核验。</w:t>
       </w:r>
     </w:p>
     <w:p>
@@ -17126,7 +17216,7 @@
         <w:drawing>
           <wp:inline xmlns:a="http://schemas.openxmlformats.org/drawingml/2006/main" xmlns:pic="http://schemas.openxmlformats.org/drawingml/2006/picture">
             <wp:extent cx="5040000" cy="2840184"/>
-            <wp:docPr id="27" name="Picture 27"/>
+            <wp:docPr id="28" name="Picture 28"/>
             <wp:cNvGraphicFramePr>
               <a:graphicFrameLocks noChangeAspect="1"/>
             </wp:cNvGraphicFramePr>
@@ -17170,7 +17260,7 @@
           <w:sz w:val="21"/>
           <w:bCs w:val="0"/>
         </w:rPr>
-        <w:t>图 6.1  JMeter 并发压力测试结果图</w:t>
+        <w:t>图 6.2  JMeter 并发压力测试结果图</w:t>
       </w:r>
     </w:p>
     <w:p>
@@ -17709,8 +17799,8 @@
     <w:p>
       <w:pPr>
         <w:sectPr>
-          <w:headerReference w:type="default" r:id="rId45"/>
-          <w:footerReference w:type="default" r:id="rId46"/>
+          <w:headerReference w:type="default" r:id="rId46"/>
+          <w:footerReference w:type="default" r:id="rId47"/>
           <w:pgSz w:w="11906" w:h="16838"/>
           <w:pgMar w:left="1587" w:right="1417" w:gutter="283" w:header="850" w:top="1417" w:footer="850" w:bottom="1417"/>
           <w:formProt w:val="false"/>
@@ -17839,8 +17929,8 @@
       </w:r>
     </w:p>
     <w:sectPr>
-      <w:headerReference w:type="default" r:id="rId47"/>
-      <w:footerReference w:type="default" r:id="rId48"/>
+      <w:headerReference w:type="default" r:id="rId48"/>
+      <w:footerReference w:type="default" r:id="rId49"/>
       <w:pgSz w:w="11906" w:h="16838"/>
       <w:pgMar w:left="1587" w:right="1417" w:gutter="283" w:header="850" w:top="1417" w:footer="850" w:bottom="1417"/>
       <w:formProt w:val="false"/>

</xml_diff>